<commit_message>
Removed my name to make the document more public, also added an opening dedication and a quote
</commit_message>
<xml_diff>
--- a/KNIGHT CONFESSIONS.docx
+++ b/KNIGHT CONFESSIONS.docx
@@ -9,6 +9,189 @@
   <w:body>
     <w:p>
       <w:pPr>
+        <w:tabs>
+          <w:tab w:val="left" w:pos="945"/>
+        </w:tabs>
+        <w:spacing w:before="100" w:beforeAutospacing="1" w:after="0" w:line="240" w:lineRule="auto"/>
+        <w:outlineLvl w:val="2"/>
+        <w:rPr>
+          <w:rFonts w:asciiTheme="majorHAnsi" w:eastAsia="Times New Roman" w:hAnsiTheme="majorHAnsi" w:cstheme="majorHAnsi"/>
+          <w:b/>
+          <w:bCs/>
+          <w:sz w:val="21"/>
+          <w:szCs w:val="21"/>
+          <w:lang w:val="en-US" w:eastAsia="en-KE"/>
+        </w:rPr>
+      </w:pPr>
+      <w:r>
+        <w:rPr>
+          <w:rFonts w:asciiTheme="majorHAnsi" w:eastAsia="Times New Roman" w:hAnsiTheme="majorHAnsi" w:cstheme="majorHAnsi"/>
+          <w:b/>
+          <w:bCs/>
+          <w:sz w:val="21"/>
+          <w:szCs w:val="21"/>
+          <w:lang w:val="en-US" w:eastAsia="en-KE"/>
+        </w:rPr>
+        <w:t>DEDICATION.</w:t>
+      </w:r>
+    </w:p>
+    <w:p>
+      <w:pPr>
+        <w:tabs>
+          <w:tab w:val="left" w:pos="945"/>
+        </w:tabs>
+        <w:spacing w:before="100" w:beforeAutospacing="1" w:after="0" w:line="240" w:lineRule="auto"/>
+        <w:outlineLvl w:val="2"/>
+        <w:rPr>
+          <w:rFonts w:asciiTheme="majorHAnsi" w:eastAsia="Times New Roman" w:hAnsiTheme="majorHAnsi" w:cstheme="majorHAnsi"/>
+          <w:sz w:val="21"/>
+          <w:szCs w:val="21"/>
+          <w:lang w:val="en-US" w:eastAsia="en-KE"/>
+        </w:rPr>
+      </w:pPr>
+      <w:r>
+        <w:rPr>
+          <w:rFonts w:asciiTheme="majorHAnsi" w:eastAsia="Times New Roman" w:hAnsiTheme="majorHAnsi" w:cstheme="majorHAnsi"/>
+          <w:sz w:val="21"/>
+          <w:szCs w:val="21"/>
+          <w:lang w:val="en-US" w:eastAsia="en-KE"/>
+        </w:rPr>
+        <w:t>Dear</w:t>
+      </w:r>
+      <w:r>
+        <w:rPr>
+          <w:rFonts w:asciiTheme="majorHAnsi" w:eastAsia="Times New Roman" w:hAnsiTheme="majorHAnsi" w:cstheme="majorHAnsi"/>
+          <w:sz w:val="21"/>
+          <w:szCs w:val="21"/>
+          <w:lang w:val="en-US" w:eastAsia="en-KE"/>
+        </w:rPr>
+        <w:t xml:space="preserve"> </w:t>
+      </w:r>
+    </w:p>
+    <w:p>
+      <w:pPr>
+        <w:rPr>
+          <w:rFonts w:asciiTheme="majorHAnsi" w:eastAsia="Times New Roman" w:hAnsiTheme="majorHAnsi" w:cstheme="majorHAnsi"/>
+          <w:b/>
+          <w:bCs/>
+          <w:sz w:val="21"/>
+          <w:szCs w:val="21"/>
+          <w:lang w:eastAsia="en-KE"/>
+        </w:rPr>
+      </w:pPr>
+      <w:r>
+        <w:rPr>
+          <w:rFonts w:asciiTheme="majorHAnsi" w:eastAsia="Times New Roman" w:hAnsiTheme="majorHAnsi" w:cstheme="majorHAnsi"/>
+          <w:b/>
+          <w:bCs/>
+          <w:sz w:val="21"/>
+          <w:szCs w:val="21"/>
+          <w:lang w:eastAsia="en-KE"/>
+        </w:rPr>
+        <w:br w:type="page"/>
+      </w:r>
+    </w:p>
+    <w:p>
+      <w:pPr>
+        <w:spacing w:before="100" w:beforeAutospacing="1" w:after="0" w:line="240" w:lineRule="auto"/>
+        <w:outlineLvl w:val="2"/>
+        <w:rPr>
+          <w:rFonts w:asciiTheme="majorHAnsi" w:eastAsia="Times New Roman" w:hAnsiTheme="majorHAnsi" w:cstheme="majorHAnsi"/>
+          <w:b/>
+          <w:bCs/>
+          <w:sz w:val="21"/>
+          <w:szCs w:val="21"/>
+          <w:lang w:eastAsia="en-KE"/>
+        </w:rPr>
+      </w:pPr>
+    </w:p>
+    <w:p>
+      <w:pPr>
+        <w:rPr>
+          <w:rFonts w:asciiTheme="majorHAnsi" w:eastAsia="Times New Roman" w:hAnsiTheme="majorHAnsi" w:cstheme="majorHAnsi"/>
+          <w:sz w:val="21"/>
+          <w:szCs w:val="21"/>
+          <w:lang w:val="en-US" w:eastAsia="en-KE"/>
+        </w:rPr>
+      </w:pPr>
+      <w:r>
+        <w:rPr>
+          <w:rFonts w:asciiTheme="majorHAnsi" w:eastAsia="Times New Roman" w:hAnsiTheme="majorHAnsi" w:cstheme="majorHAnsi"/>
+          <w:sz w:val="21"/>
+          <w:szCs w:val="21"/>
+          <w:lang w:val="en-US" w:eastAsia="en-KE"/>
+        </w:rPr>
+        <w:t>The ability t</w:t>
+      </w:r>
+      <w:r>
+        <w:rPr>
+          <w:rFonts w:asciiTheme="majorHAnsi" w:eastAsia="Times New Roman" w:hAnsiTheme="majorHAnsi" w:cstheme="majorHAnsi"/>
+          <w:sz w:val="21"/>
+          <w:szCs w:val="21"/>
+          <w:lang w:val="en-US" w:eastAsia="en-KE"/>
+        </w:rPr>
+        <w:t>o write is not passed down nor learned, it’s felt and, in those moments, —don’t shy, you might write until one day, you write and idea of your own.</w:t>
+      </w:r>
+    </w:p>
+    <w:p>
+      <w:pPr>
+        <w:rPr>
+          <w:rFonts w:asciiTheme="majorHAnsi" w:eastAsia="Times New Roman" w:hAnsiTheme="majorHAnsi" w:cstheme="majorHAnsi"/>
+          <w:sz w:val="21"/>
+          <w:szCs w:val="21"/>
+          <w:lang w:val="en-US" w:eastAsia="en-KE"/>
+        </w:rPr>
+      </w:pPr>
+      <w:r>
+        <w:rPr>
+          <w:rFonts w:asciiTheme="majorHAnsi" w:eastAsia="Times New Roman" w:hAnsiTheme="majorHAnsi" w:cstheme="majorHAnsi"/>
+          <w:sz w:val="21"/>
+          <w:szCs w:val="21"/>
+          <w:lang w:val="en-US" w:eastAsia="en-KE"/>
+        </w:rPr>
+        <w:t>—Poet Teardrop</w:t>
+      </w:r>
+    </w:p>
+    <w:p>
+      <w:pPr>
+        <w:rPr>
+          <w:rFonts w:asciiTheme="majorHAnsi" w:eastAsia="Times New Roman" w:hAnsiTheme="majorHAnsi" w:cstheme="majorHAnsi"/>
+          <w:sz w:val="21"/>
+          <w:szCs w:val="21"/>
+          <w:lang w:val="en-US" w:eastAsia="en-KE"/>
+        </w:rPr>
+      </w:pPr>
+    </w:p>
+    <w:p>
+      <w:pPr>
+        <w:rPr>
+          <w:rFonts w:asciiTheme="majorHAnsi" w:eastAsia="Times New Roman" w:hAnsiTheme="majorHAnsi" w:cstheme="majorHAnsi"/>
+          <w:sz w:val="21"/>
+          <w:szCs w:val="21"/>
+          <w:lang w:eastAsia="en-KE"/>
+        </w:rPr>
+      </w:pPr>
+      <w:r>
+        <w:rPr>
+          <w:rFonts w:asciiTheme="majorHAnsi" w:eastAsia="Times New Roman" w:hAnsiTheme="majorHAnsi" w:cstheme="majorHAnsi"/>
+          <w:sz w:val="21"/>
+          <w:szCs w:val="21"/>
+          <w:lang w:val="en-US" w:eastAsia="en-KE"/>
+        </w:rPr>
+        <w:t xml:space="preserve"> </w:t>
+      </w:r>
+      <w:r>
+        <w:rPr>
+          <w:rFonts w:asciiTheme="majorHAnsi" w:eastAsia="Times New Roman" w:hAnsiTheme="majorHAnsi" w:cstheme="majorHAnsi"/>
+          <w:sz w:val="21"/>
+          <w:szCs w:val="21"/>
+          <w:lang w:eastAsia="en-KE"/>
+        </w:rPr>
+        <w:br w:type="page"/>
+      </w:r>
+    </w:p>
+    <w:p>
+      <w:pPr>
         <w:pStyle w:val="ListParagraph"/>
         <w:numPr>
           <w:ilvl w:val="0"/>
@@ -34,6 +217,7 @@
           <w:szCs w:val="21"/>
           <w:lang w:eastAsia="en-KE"/>
         </w:rPr>
+        <w:lastRenderedPageBreak/>
         <w:t>I Know a Girl</w:t>
       </w:r>
     </w:p>
@@ -241,6 +425,7 @@
           <w:szCs w:val="21"/>
           <w:lang w:eastAsia="en-KE"/>
         </w:rPr>
+        <w:lastRenderedPageBreak/>
         <w:t>Maybe I love her,</w:t>
       </w:r>
       <w:r>
@@ -744,6 +929,14 @@
           <w:szCs w:val="21"/>
         </w:rPr>
         <w:br/>
+      </w:r>
+      <w:r>
+        <w:rPr>
+          <w:rFonts w:asciiTheme="majorHAnsi" w:hAnsiTheme="majorHAnsi" w:cstheme="majorHAnsi"/>
+          <w:sz w:val="21"/>
+          <w:szCs w:val="21"/>
+        </w:rPr>
+        <w:lastRenderedPageBreak/>
         <w:t>A friendship carrying more weight</w:t>
       </w:r>
       <w:r>
@@ -920,28 +1113,6 @@
         </w:rPr>
         <w:t>than staying.</w:t>
       </w:r>
-    </w:p>
-    <w:p>
-      <w:pPr>
-        <w:pStyle w:val="NormalWeb"/>
-        <w:spacing w:after="0" w:afterAutospacing="0"/>
-        <w:rPr>
-          <w:rFonts w:asciiTheme="majorHAnsi" w:hAnsiTheme="majorHAnsi" w:cstheme="majorHAnsi"/>
-          <w:sz w:val="21"/>
-          <w:szCs w:val="21"/>
-        </w:rPr>
-      </w:pPr>
-    </w:p>
-    <w:p>
-      <w:pPr>
-        <w:pStyle w:val="NormalWeb"/>
-        <w:spacing w:after="0" w:afterAutospacing="0"/>
-        <w:rPr>
-          <w:rFonts w:asciiTheme="majorHAnsi" w:hAnsiTheme="majorHAnsi" w:cstheme="majorHAnsi"/>
-          <w:sz w:val="21"/>
-          <w:szCs w:val="21"/>
-        </w:rPr>
-      </w:pPr>
     </w:p>
     <w:p>
       <w:pPr>
@@ -1015,6 +1186,14 @@
           <w:szCs w:val="21"/>
         </w:rPr>
         <w:br/>
+      </w:r>
+      <w:r>
+        <w:rPr>
+          <w:rFonts w:asciiTheme="majorHAnsi" w:hAnsiTheme="majorHAnsi" w:cstheme="majorHAnsi"/>
+          <w:sz w:val="21"/>
+          <w:szCs w:val="21"/>
+        </w:rPr>
+        <w:lastRenderedPageBreak/>
         <w:t>You remind me of that one book... what's it called?</w:t>
       </w:r>
       <w:r>
@@ -1362,6 +1541,14 @@
           <w:szCs w:val="21"/>
         </w:rPr>
         <w:br/>
+      </w:r>
+      <w:r>
+        <w:rPr>
+          <w:rFonts w:asciiTheme="majorHAnsi" w:hAnsiTheme="majorHAnsi" w:cstheme="majorHAnsi"/>
+          <w:sz w:val="21"/>
+          <w:szCs w:val="21"/>
+        </w:rPr>
+        <w:lastRenderedPageBreak/>
         <w:t xml:space="preserve">Every </w:t>
       </w:r>
       <w:r>
@@ -1575,76 +1762,6 @@
         </w:rPr>
         <w:t>White moves first, and Black waits after.</w:t>
       </w:r>
-    </w:p>
-    <w:p>
-      <w:pPr>
-        <w:pStyle w:val="Heading3"/>
-        <w:spacing w:after="0" w:afterAutospacing="0"/>
-        <w:rPr>
-          <w:rStyle w:val="Strong"/>
-          <w:rFonts w:asciiTheme="majorHAnsi" w:hAnsiTheme="majorHAnsi" w:cstheme="majorHAnsi"/>
-          <w:b/>
-          <w:bCs/>
-          <w:sz w:val="21"/>
-          <w:szCs w:val="21"/>
-        </w:rPr>
-      </w:pPr>
-    </w:p>
-    <w:p>
-      <w:pPr>
-        <w:pStyle w:val="Heading3"/>
-        <w:spacing w:after="0" w:afterAutospacing="0"/>
-        <w:rPr>
-          <w:rStyle w:val="Strong"/>
-          <w:rFonts w:asciiTheme="majorHAnsi" w:hAnsiTheme="majorHAnsi" w:cstheme="majorHAnsi"/>
-          <w:b/>
-          <w:bCs/>
-          <w:sz w:val="21"/>
-          <w:szCs w:val="21"/>
-        </w:rPr>
-      </w:pPr>
-    </w:p>
-    <w:p>
-      <w:pPr>
-        <w:pStyle w:val="Heading3"/>
-        <w:spacing w:after="0" w:afterAutospacing="0"/>
-        <w:rPr>
-          <w:rStyle w:val="Strong"/>
-          <w:rFonts w:asciiTheme="majorHAnsi" w:hAnsiTheme="majorHAnsi" w:cstheme="majorHAnsi"/>
-          <w:b/>
-          <w:bCs/>
-          <w:sz w:val="21"/>
-          <w:szCs w:val="21"/>
-        </w:rPr>
-      </w:pPr>
-    </w:p>
-    <w:p>
-      <w:pPr>
-        <w:pStyle w:val="Heading3"/>
-        <w:spacing w:after="0" w:afterAutospacing="0"/>
-        <w:rPr>
-          <w:rStyle w:val="Strong"/>
-          <w:rFonts w:asciiTheme="majorHAnsi" w:hAnsiTheme="majorHAnsi" w:cstheme="majorHAnsi"/>
-          <w:b/>
-          <w:bCs/>
-          <w:sz w:val="21"/>
-          <w:szCs w:val="21"/>
-        </w:rPr>
-      </w:pPr>
-    </w:p>
-    <w:p>
-      <w:pPr>
-        <w:pStyle w:val="Heading3"/>
-        <w:spacing w:after="0" w:afterAutospacing="0"/>
-        <w:rPr>
-          <w:rStyle w:val="Strong"/>
-          <w:rFonts w:asciiTheme="majorHAnsi" w:hAnsiTheme="majorHAnsi" w:cstheme="majorHAnsi"/>
-          <w:b/>
-          <w:bCs/>
-          <w:sz w:val="21"/>
-          <w:szCs w:val="21"/>
-        </w:rPr>
-      </w:pPr>
     </w:p>
     <w:p>
       <w:pPr>
@@ -1825,6 +1942,7 @@
           <w:sz w:val="21"/>
           <w:szCs w:val="21"/>
         </w:rPr>
+        <w:lastRenderedPageBreak/>
         <w:t>But the days given turned into weeks,</w:t>
       </w:r>
       <w:r>
@@ -2326,6 +2444,7 @@
           <w:szCs w:val="21"/>
           <w:lang w:val="en-US"/>
         </w:rPr>
+        <w:lastRenderedPageBreak/>
         <w:t xml:space="preserve">The scorching was too much and it was now dying, and in </w:t>
       </w:r>
       <w:r>
@@ -2377,7 +2496,6 @@
           <w:szCs w:val="21"/>
           <w:lang w:val="en-US"/>
         </w:rPr>
-        <w:lastRenderedPageBreak/>
         <w:t>She met a friend,</w:t>
       </w:r>
       <w:r>
@@ -2959,6 +3077,15 @@
           <w:lang w:eastAsia="en-KE"/>
         </w:rPr>
         <w:br/>
+      </w:r>
+      <w:r>
+        <w:rPr>
+          <w:rFonts w:asciiTheme="majorHAnsi" w:eastAsia="Times New Roman" w:hAnsiTheme="majorHAnsi" w:cstheme="majorHAnsi"/>
+          <w:sz w:val="21"/>
+          <w:szCs w:val="21"/>
+          <w:lang w:eastAsia="en-KE"/>
+        </w:rPr>
+        <w:lastRenderedPageBreak/>
         <w:t>The concept of shakeable future has made me Gray</w:t>
       </w:r>
       <w:r>
@@ -3240,6 +3367,15 @@
           <w:lang w:eastAsia="en-KE"/>
         </w:rPr>
         <w:br/>
+      </w:r>
+      <w:r>
+        <w:rPr>
+          <w:rFonts w:asciiTheme="majorHAnsi" w:eastAsia="Times New Roman" w:hAnsiTheme="majorHAnsi" w:cstheme="majorHAnsi"/>
+          <w:sz w:val="21"/>
+          <w:szCs w:val="21"/>
+          <w:lang w:eastAsia="en-KE"/>
+        </w:rPr>
+        <w:lastRenderedPageBreak/>
         <w:t>My baby had known</w:t>
       </w:r>
       <w:r>
@@ -3278,15 +3414,6 @@
           <w:lang w:eastAsia="en-KE"/>
         </w:rPr>
         <w:br/>
-      </w:r>
-      <w:r>
-        <w:rPr>
-          <w:rFonts w:asciiTheme="majorHAnsi" w:eastAsia="Times New Roman" w:hAnsiTheme="majorHAnsi" w:cstheme="majorHAnsi"/>
-          <w:sz w:val="21"/>
-          <w:szCs w:val="21"/>
-          <w:lang w:eastAsia="en-KE"/>
-        </w:rPr>
-        <w:lastRenderedPageBreak/>
         <w:t>By 9 pm, he was losing to it,</w:t>
       </w:r>
       <w:r>
@@ -3509,6 +3636,14 @@
           <w:szCs w:val="21"/>
         </w:rPr>
         <w:br/>
+      </w:r>
+      <w:r>
+        <w:rPr>
+          <w:rFonts w:asciiTheme="majorHAnsi" w:hAnsiTheme="majorHAnsi" w:cstheme="majorHAnsi"/>
+          <w:sz w:val="21"/>
+          <w:szCs w:val="21"/>
+        </w:rPr>
+        <w:lastRenderedPageBreak/>
         <w:t>Just the soft sound of two small feet —</w:t>
       </w:r>
       <w:r>
@@ -3764,6 +3899,7 @@
           <w:sz w:val="21"/>
           <w:szCs w:val="21"/>
         </w:rPr>
+        <w:lastRenderedPageBreak/>
         <w:t>“This is daddy. He’s in heaven.”</w:t>
       </w:r>
       <w:r>
@@ -3782,14 +3918,6 @@
           <w:szCs w:val="21"/>
         </w:rPr>
         <w:br/>
-      </w:r>
-      <w:r>
-        <w:rPr>
-          <w:rFonts w:asciiTheme="majorHAnsi" w:hAnsiTheme="majorHAnsi" w:cstheme="majorHAnsi"/>
-          <w:sz w:val="21"/>
-          <w:szCs w:val="21"/>
-        </w:rPr>
-        <w:lastRenderedPageBreak/>
         <w:t>And maybe it is.</w:t>
       </w:r>
       <w:r>
@@ -4073,6 +4201,14 @@
           <w:szCs w:val="21"/>
         </w:rPr>
         <w:br/>
+      </w:r>
+      <w:r>
+        <w:rPr>
+          <w:rFonts w:asciiTheme="majorHAnsi" w:hAnsiTheme="majorHAnsi" w:cstheme="majorHAnsi"/>
+          <w:sz w:val="21"/>
+          <w:szCs w:val="21"/>
+        </w:rPr>
+        <w:lastRenderedPageBreak/>
         <w:t>The boys know only us.</w:t>
       </w:r>
       <w:r>
@@ -5124,6 +5260,7 @@
           <w:szCs w:val="21"/>
           <w:lang w:val="en-US"/>
         </w:rPr>
+        <w:lastRenderedPageBreak/>
         <w:t>I daily fall for the mind I have and wish it on everyone else</w:t>
       </w:r>
     </w:p>
@@ -5519,6 +5656,7 @@
           <w:sz w:val="21"/>
           <w:szCs w:val="21"/>
         </w:rPr>
+        <w:lastRenderedPageBreak/>
         <w:t>Everyone’s posting their queens</w:t>
       </w:r>
       <w:r>
@@ -5537,7 +5675,229 @@
           <w:szCs w:val="21"/>
         </w:rPr>
         <w:br/>
-      </w:r>
+        <w:t>“Mum was my dad too,” they write</w:t>
+      </w:r>
+      <w:r>
+        <w:rPr>
+          <w:rFonts w:asciiTheme="majorHAnsi" w:hAnsiTheme="majorHAnsi" w:cstheme="majorHAnsi"/>
+          <w:sz w:val="21"/>
+          <w:szCs w:val="21"/>
+          <w:lang w:val="en-US"/>
+        </w:rPr>
+        <w:t>,</w:t>
+      </w:r>
+      <w:r>
+        <w:rPr>
+          <w:rFonts w:asciiTheme="majorHAnsi" w:hAnsiTheme="majorHAnsi" w:cstheme="majorHAnsi"/>
+          <w:sz w:val="21"/>
+          <w:szCs w:val="21"/>
+        </w:rPr>
+        <w:br/>
+        <w:t>as if May wasn't enough</w:t>
+      </w:r>
+      <w:r>
+        <w:rPr>
+          <w:rFonts w:asciiTheme="majorHAnsi" w:hAnsiTheme="majorHAnsi" w:cstheme="majorHAnsi"/>
+          <w:sz w:val="21"/>
+          <w:szCs w:val="21"/>
+        </w:rPr>
+        <w:br/>
+        <w:t>to crown her sacrifice.</w:t>
+      </w:r>
+    </w:p>
+    <w:p>
+      <w:pPr>
+        <w:pStyle w:val="NormalWeb"/>
+        <w:spacing w:after="0" w:afterAutospacing="0"/>
+        <w:rPr>
+          <w:rFonts w:asciiTheme="majorHAnsi" w:hAnsiTheme="majorHAnsi" w:cstheme="majorHAnsi"/>
+          <w:sz w:val="21"/>
+          <w:szCs w:val="21"/>
+        </w:rPr>
+      </w:pPr>
+      <w:r>
+        <w:rPr>
+          <w:rFonts w:asciiTheme="majorHAnsi" w:hAnsiTheme="majorHAnsi" w:cstheme="majorHAnsi"/>
+          <w:sz w:val="21"/>
+          <w:szCs w:val="21"/>
+        </w:rPr>
+        <w:t>I see you,</w:t>
+      </w:r>
+      <w:r>
+        <w:rPr>
+          <w:rFonts w:asciiTheme="majorHAnsi" w:hAnsiTheme="majorHAnsi" w:cstheme="majorHAnsi"/>
+          <w:sz w:val="21"/>
+          <w:szCs w:val="21"/>
+        </w:rPr>
+        <w:br/>
+        <w:t>Your dad was absent,</w:t>
+      </w:r>
+      <w:r>
+        <w:rPr>
+          <w:rFonts w:asciiTheme="majorHAnsi" w:hAnsiTheme="majorHAnsi" w:cstheme="majorHAnsi"/>
+          <w:sz w:val="21"/>
+          <w:szCs w:val="21"/>
+        </w:rPr>
+        <w:br/>
+        <w:t>but so was your restraint.</w:t>
+      </w:r>
+      <w:r>
+        <w:rPr>
+          <w:rFonts w:asciiTheme="majorHAnsi" w:hAnsiTheme="majorHAnsi" w:cstheme="majorHAnsi"/>
+          <w:sz w:val="21"/>
+          <w:szCs w:val="21"/>
+        </w:rPr>
+        <w:br/>
+        <w:t>Today’s not about healing wounds with substitutions.</w:t>
+      </w:r>
+      <w:r>
+        <w:rPr>
+          <w:rFonts w:asciiTheme="majorHAnsi" w:hAnsiTheme="majorHAnsi" w:cstheme="majorHAnsi"/>
+          <w:sz w:val="21"/>
+          <w:szCs w:val="21"/>
+        </w:rPr>
+        <w:br/>
+        <w:t>Today, let men have their day.</w:t>
+      </w:r>
+    </w:p>
+    <w:p>
+      <w:pPr>
+        <w:pStyle w:val="NormalWeb"/>
+        <w:spacing w:after="0" w:afterAutospacing="0"/>
+        <w:rPr>
+          <w:rFonts w:asciiTheme="majorHAnsi" w:hAnsiTheme="majorHAnsi" w:cstheme="majorHAnsi"/>
+          <w:sz w:val="21"/>
+          <w:szCs w:val="21"/>
+        </w:rPr>
+      </w:pPr>
+      <w:r>
+        <w:rPr>
+          <w:rFonts w:asciiTheme="majorHAnsi" w:hAnsiTheme="majorHAnsi" w:cstheme="majorHAnsi"/>
+          <w:sz w:val="21"/>
+          <w:szCs w:val="21"/>
+        </w:rPr>
+        <w:t>Celebrate the ones who stayed,</w:t>
+      </w:r>
+      <w:r>
+        <w:rPr>
+          <w:rFonts w:asciiTheme="majorHAnsi" w:hAnsiTheme="majorHAnsi" w:cstheme="majorHAnsi"/>
+          <w:sz w:val="21"/>
+          <w:szCs w:val="21"/>
+        </w:rPr>
+        <w:br/>
+        <w:t>who raised, who paid,</w:t>
+      </w:r>
+      <w:r>
+        <w:rPr>
+          <w:rFonts w:asciiTheme="majorHAnsi" w:hAnsiTheme="majorHAnsi" w:cstheme="majorHAnsi"/>
+          <w:sz w:val="21"/>
+          <w:szCs w:val="21"/>
+        </w:rPr>
+        <w:br/>
+        <w:t>who sat through school plays in silence,</w:t>
+      </w:r>
+      <w:r>
+        <w:rPr>
+          <w:rFonts w:asciiTheme="majorHAnsi" w:hAnsiTheme="majorHAnsi" w:cstheme="majorHAnsi"/>
+          <w:sz w:val="21"/>
+          <w:szCs w:val="21"/>
+        </w:rPr>
+        <w:br/>
+        <w:t>who taught you how to ride and how to pray.</w:t>
+      </w:r>
+      <w:r>
+        <w:rPr>
+          <w:rFonts w:asciiTheme="majorHAnsi" w:hAnsiTheme="majorHAnsi" w:cstheme="majorHAnsi"/>
+          <w:sz w:val="21"/>
+          <w:szCs w:val="21"/>
+        </w:rPr>
+        <w:br/>
+        <w:t>Men who loved you</w:t>
+      </w:r>
+      <w:r>
+        <w:rPr>
+          <w:rFonts w:asciiTheme="majorHAnsi" w:hAnsiTheme="majorHAnsi" w:cstheme="majorHAnsi"/>
+          <w:sz w:val="21"/>
+          <w:szCs w:val="21"/>
+        </w:rPr>
+        <w:br/>
+        <w:t>without shouting it.</w:t>
+      </w:r>
+    </w:p>
+    <w:p>
+      <w:pPr>
+        <w:pStyle w:val="NormalWeb"/>
+        <w:spacing w:after="0" w:afterAutospacing="0"/>
+        <w:rPr>
+          <w:rFonts w:asciiTheme="majorHAnsi" w:hAnsiTheme="majorHAnsi" w:cstheme="majorHAnsi"/>
+          <w:sz w:val="21"/>
+          <w:szCs w:val="21"/>
+        </w:rPr>
+      </w:pPr>
+      <w:r>
+        <w:rPr>
+          <w:rFonts w:asciiTheme="majorHAnsi" w:hAnsiTheme="majorHAnsi" w:cstheme="majorHAnsi"/>
+          <w:sz w:val="21"/>
+          <w:szCs w:val="21"/>
+        </w:rPr>
+        <w:t>And yes, mums do a lot</w:t>
+      </w:r>
+      <w:r>
+        <w:rPr>
+          <w:rFonts w:asciiTheme="majorHAnsi" w:hAnsiTheme="majorHAnsi" w:cstheme="majorHAnsi"/>
+          <w:sz w:val="21"/>
+          <w:szCs w:val="21"/>
+          <w:lang w:val="en-US"/>
+        </w:rPr>
+        <w:t>.</w:t>
+      </w:r>
+      <w:r>
+        <w:rPr>
+          <w:rFonts w:asciiTheme="majorHAnsi" w:hAnsiTheme="majorHAnsi" w:cstheme="majorHAnsi"/>
+          <w:sz w:val="21"/>
+          <w:szCs w:val="21"/>
+        </w:rPr>
+        <w:br/>
+        <w:t>We gave them their flowers last month.</w:t>
+      </w:r>
+      <w:r>
+        <w:rPr>
+          <w:rFonts w:asciiTheme="majorHAnsi" w:hAnsiTheme="majorHAnsi" w:cstheme="majorHAnsi"/>
+          <w:sz w:val="21"/>
+          <w:szCs w:val="21"/>
+        </w:rPr>
+        <w:br/>
+        <w:t>We posted the collages,</w:t>
+      </w:r>
+      <w:r>
+        <w:rPr>
+          <w:rFonts w:asciiTheme="majorHAnsi" w:hAnsiTheme="majorHAnsi" w:cstheme="majorHAnsi"/>
+          <w:sz w:val="21"/>
+          <w:szCs w:val="21"/>
+        </w:rPr>
+        <w:br/>
+        <w:t>we wrote the poems,</w:t>
+      </w:r>
+      <w:r>
+        <w:rPr>
+          <w:rFonts w:asciiTheme="majorHAnsi" w:hAnsiTheme="majorHAnsi" w:cstheme="majorHAnsi"/>
+          <w:sz w:val="21"/>
+          <w:szCs w:val="21"/>
+        </w:rPr>
+        <w:br/>
+        <w:t>we cried on their shoulders.</w:t>
+      </w:r>
+    </w:p>
+    <w:p>
+      <w:pPr>
+        <w:pStyle w:val="NormalWeb"/>
+        <w:spacing w:after="0" w:afterAutospacing="0"/>
+        <w:rPr>
+          <w:rFonts w:asciiTheme="majorHAnsi" w:hAnsiTheme="majorHAnsi" w:cstheme="majorHAnsi"/>
+          <w:sz w:val="21"/>
+          <w:szCs w:val="21"/>
+        </w:rPr>
+      </w:pPr>
       <w:r>
         <w:rPr>
           <w:rFonts w:asciiTheme="majorHAnsi" w:hAnsiTheme="majorHAnsi" w:cstheme="majorHAnsi"/>
@@ -5545,235 +5905,6 @@
           <w:szCs w:val="21"/>
         </w:rPr>
         <w:lastRenderedPageBreak/>
-        <w:t>“Mum was my dad too,” they write</w:t>
-      </w:r>
-      <w:r>
-        <w:rPr>
-          <w:rFonts w:asciiTheme="majorHAnsi" w:hAnsiTheme="majorHAnsi" w:cstheme="majorHAnsi"/>
-          <w:sz w:val="21"/>
-          <w:szCs w:val="21"/>
-          <w:lang w:val="en-US"/>
-        </w:rPr>
-        <w:t>,</w:t>
-      </w:r>
-      <w:r>
-        <w:rPr>
-          <w:rFonts w:asciiTheme="majorHAnsi" w:hAnsiTheme="majorHAnsi" w:cstheme="majorHAnsi"/>
-          <w:sz w:val="21"/>
-          <w:szCs w:val="21"/>
-        </w:rPr>
-        <w:br/>
-        <w:t>as if May wasn't enough</w:t>
-      </w:r>
-      <w:r>
-        <w:rPr>
-          <w:rFonts w:asciiTheme="majorHAnsi" w:hAnsiTheme="majorHAnsi" w:cstheme="majorHAnsi"/>
-          <w:sz w:val="21"/>
-          <w:szCs w:val="21"/>
-        </w:rPr>
-        <w:br/>
-        <w:t>to crown her sacrifice.</w:t>
-      </w:r>
-    </w:p>
-    <w:p>
-      <w:pPr>
-        <w:pStyle w:val="NormalWeb"/>
-        <w:spacing w:after="0" w:afterAutospacing="0"/>
-        <w:rPr>
-          <w:rFonts w:asciiTheme="majorHAnsi" w:hAnsiTheme="majorHAnsi" w:cstheme="majorHAnsi"/>
-          <w:sz w:val="21"/>
-          <w:szCs w:val="21"/>
-        </w:rPr>
-      </w:pPr>
-      <w:r>
-        <w:rPr>
-          <w:rFonts w:asciiTheme="majorHAnsi" w:hAnsiTheme="majorHAnsi" w:cstheme="majorHAnsi"/>
-          <w:sz w:val="21"/>
-          <w:szCs w:val="21"/>
-        </w:rPr>
-        <w:t>I see you,</w:t>
-      </w:r>
-      <w:r>
-        <w:rPr>
-          <w:rFonts w:asciiTheme="majorHAnsi" w:hAnsiTheme="majorHAnsi" w:cstheme="majorHAnsi"/>
-          <w:sz w:val="21"/>
-          <w:szCs w:val="21"/>
-        </w:rPr>
-        <w:br/>
-        <w:t>Your dad was absent,</w:t>
-      </w:r>
-      <w:r>
-        <w:rPr>
-          <w:rFonts w:asciiTheme="majorHAnsi" w:hAnsiTheme="majorHAnsi" w:cstheme="majorHAnsi"/>
-          <w:sz w:val="21"/>
-          <w:szCs w:val="21"/>
-        </w:rPr>
-        <w:br/>
-        <w:t>but so was your restraint.</w:t>
-      </w:r>
-      <w:r>
-        <w:rPr>
-          <w:rFonts w:asciiTheme="majorHAnsi" w:hAnsiTheme="majorHAnsi" w:cstheme="majorHAnsi"/>
-          <w:sz w:val="21"/>
-          <w:szCs w:val="21"/>
-        </w:rPr>
-        <w:br/>
-        <w:t>Today’s not about healing wounds with substitutions.</w:t>
-      </w:r>
-      <w:r>
-        <w:rPr>
-          <w:rFonts w:asciiTheme="majorHAnsi" w:hAnsiTheme="majorHAnsi" w:cstheme="majorHAnsi"/>
-          <w:sz w:val="21"/>
-          <w:szCs w:val="21"/>
-        </w:rPr>
-        <w:br/>
-        <w:t>Today, let men have their day.</w:t>
-      </w:r>
-    </w:p>
-    <w:p>
-      <w:pPr>
-        <w:pStyle w:val="NormalWeb"/>
-        <w:spacing w:after="0" w:afterAutospacing="0"/>
-        <w:rPr>
-          <w:rFonts w:asciiTheme="majorHAnsi" w:hAnsiTheme="majorHAnsi" w:cstheme="majorHAnsi"/>
-          <w:sz w:val="21"/>
-          <w:szCs w:val="21"/>
-        </w:rPr>
-      </w:pPr>
-      <w:r>
-        <w:rPr>
-          <w:rFonts w:asciiTheme="majorHAnsi" w:hAnsiTheme="majorHAnsi" w:cstheme="majorHAnsi"/>
-          <w:sz w:val="21"/>
-          <w:szCs w:val="21"/>
-        </w:rPr>
-        <w:t>Celebrate the ones who stayed,</w:t>
-      </w:r>
-      <w:r>
-        <w:rPr>
-          <w:rFonts w:asciiTheme="majorHAnsi" w:hAnsiTheme="majorHAnsi" w:cstheme="majorHAnsi"/>
-          <w:sz w:val="21"/>
-          <w:szCs w:val="21"/>
-        </w:rPr>
-        <w:br/>
-        <w:t>who raised, who paid,</w:t>
-      </w:r>
-      <w:r>
-        <w:rPr>
-          <w:rFonts w:asciiTheme="majorHAnsi" w:hAnsiTheme="majorHAnsi" w:cstheme="majorHAnsi"/>
-          <w:sz w:val="21"/>
-          <w:szCs w:val="21"/>
-        </w:rPr>
-        <w:br/>
-        <w:t>who sat through school plays in silence,</w:t>
-      </w:r>
-      <w:r>
-        <w:rPr>
-          <w:rFonts w:asciiTheme="majorHAnsi" w:hAnsiTheme="majorHAnsi" w:cstheme="majorHAnsi"/>
-          <w:sz w:val="21"/>
-          <w:szCs w:val="21"/>
-        </w:rPr>
-        <w:br/>
-        <w:t>who taught you how to ride and how to pray.</w:t>
-      </w:r>
-      <w:r>
-        <w:rPr>
-          <w:rFonts w:asciiTheme="majorHAnsi" w:hAnsiTheme="majorHAnsi" w:cstheme="majorHAnsi"/>
-          <w:sz w:val="21"/>
-          <w:szCs w:val="21"/>
-        </w:rPr>
-        <w:br/>
-        <w:t>Men who loved you</w:t>
-      </w:r>
-      <w:r>
-        <w:rPr>
-          <w:rFonts w:asciiTheme="majorHAnsi" w:hAnsiTheme="majorHAnsi" w:cstheme="majorHAnsi"/>
-          <w:sz w:val="21"/>
-          <w:szCs w:val="21"/>
-        </w:rPr>
-        <w:br/>
-        <w:t>without shouting it.</w:t>
-      </w:r>
-    </w:p>
-    <w:p>
-      <w:pPr>
-        <w:pStyle w:val="NormalWeb"/>
-        <w:spacing w:after="0" w:afterAutospacing="0"/>
-        <w:rPr>
-          <w:rFonts w:asciiTheme="majorHAnsi" w:hAnsiTheme="majorHAnsi" w:cstheme="majorHAnsi"/>
-          <w:sz w:val="21"/>
-          <w:szCs w:val="21"/>
-        </w:rPr>
-      </w:pPr>
-      <w:r>
-        <w:rPr>
-          <w:rFonts w:asciiTheme="majorHAnsi" w:hAnsiTheme="majorHAnsi" w:cstheme="majorHAnsi"/>
-          <w:sz w:val="21"/>
-          <w:szCs w:val="21"/>
-        </w:rPr>
-        <w:t>And yes, mums do a lot</w:t>
-      </w:r>
-      <w:r>
-        <w:rPr>
-          <w:rFonts w:asciiTheme="majorHAnsi" w:hAnsiTheme="majorHAnsi" w:cstheme="majorHAnsi"/>
-          <w:sz w:val="21"/>
-          <w:szCs w:val="21"/>
-          <w:lang w:val="en-US"/>
-        </w:rPr>
-        <w:t>.</w:t>
-      </w:r>
-      <w:r>
-        <w:rPr>
-          <w:rFonts w:asciiTheme="majorHAnsi" w:hAnsiTheme="majorHAnsi" w:cstheme="majorHAnsi"/>
-          <w:sz w:val="21"/>
-          <w:szCs w:val="21"/>
-        </w:rPr>
-        <w:br/>
-        <w:t>We gave them their flowers last month.</w:t>
-      </w:r>
-      <w:r>
-        <w:rPr>
-          <w:rFonts w:asciiTheme="majorHAnsi" w:hAnsiTheme="majorHAnsi" w:cstheme="majorHAnsi"/>
-          <w:sz w:val="21"/>
-          <w:szCs w:val="21"/>
-        </w:rPr>
-        <w:br/>
-        <w:t>We posted the collages,</w:t>
-      </w:r>
-      <w:r>
-        <w:rPr>
-          <w:rFonts w:asciiTheme="majorHAnsi" w:hAnsiTheme="majorHAnsi" w:cstheme="majorHAnsi"/>
-          <w:sz w:val="21"/>
-          <w:szCs w:val="21"/>
-        </w:rPr>
-        <w:br/>
-        <w:t>we wrote the poems,</w:t>
-      </w:r>
-      <w:r>
-        <w:rPr>
-          <w:rFonts w:asciiTheme="majorHAnsi" w:hAnsiTheme="majorHAnsi" w:cstheme="majorHAnsi"/>
-          <w:sz w:val="21"/>
-          <w:szCs w:val="21"/>
-        </w:rPr>
-        <w:br/>
-        <w:t>we cried on their shoulders.</w:t>
-      </w:r>
-    </w:p>
-    <w:p>
-      <w:pPr>
-        <w:pStyle w:val="NormalWeb"/>
-        <w:spacing w:after="0" w:afterAutospacing="0"/>
-        <w:rPr>
-          <w:rFonts w:asciiTheme="majorHAnsi" w:hAnsiTheme="majorHAnsi" w:cstheme="majorHAnsi"/>
-          <w:sz w:val="21"/>
-          <w:szCs w:val="21"/>
-        </w:rPr>
-      </w:pPr>
-      <w:r>
-        <w:rPr>
-          <w:rFonts w:asciiTheme="majorHAnsi" w:hAnsiTheme="majorHAnsi" w:cstheme="majorHAnsi"/>
-          <w:sz w:val="21"/>
-          <w:szCs w:val="21"/>
-        </w:rPr>
         <w:t>But this?</w:t>
       </w:r>
       <w:r>
@@ -6171,32 +6302,32 @@
           <w:sz w:val="21"/>
           <w:szCs w:val="21"/>
         </w:rPr>
+        <w:t>She's my sun</w:t>
+      </w:r>
+    </w:p>
+    <w:p>
+      <w:pPr>
+        <w:pStyle w:val="NormalWeb"/>
+        <w:spacing w:before="0" w:beforeAutospacing="0" w:after="0" w:afterAutospacing="0"/>
+        <w:rPr>
+          <w:rStyle w:val="Emphasis"/>
+          <w:rFonts w:asciiTheme="majorHAnsi" w:hAnsiTheme="majorHAnsi" w:cstheme="majorHAnsi"/>
+          <w:i w:val="0"/>
+          <w:iCs w:val="0"/>
+          <w:sz w:val="21"/>
+          <w:szCs w:val="21"/>
+        </w:rPr>
+      </w:pPr>
+      <w:r>
+        <w:rPr>
+          <w:rStyle w:val="Emphasis"/>
+          <w:rFonts w:asciiTheme="majorHAnsi" w:hAnsiTheme="majorHAnsi" w:cstheme="majorHAnsi"/>
+          <w:i w:val="0"/>
+          <w:iCs w:val="0"/>
+          <w:sz w:val="21"/>
+          <w:szCs w:val="21"/>
+        </w:rPr>
         <w:lastRenderedPageBreak/>
-        <w:t>She's my sun</w:t>
-      </w:r>
-    </w:p>
-    <w:p>
-      <w:pPr>
-        <w:pStyle w:val="NormalWeb"/>
-        <w:spacing w:before="0" w:beforeAutospacing="0" w:after="0" w:afterAutospacing="0"/>
-        <w:rPr>
-          <w:rStyle w:val="Emphasis"/>
-          <w:rFonts w:asciiTheme="majorHAnsi" w:hAnsiTheme="majorHAnsi" w:cstheme="majorHAnsi"/>
-          <w:i w:val="0"/>
-          <w:iCs w:val="0"/>
-          <w:sz w:val="21"/>
-          <w:szCs w:val="21"/>
-        </w:rPr>
-      </w:pPr>
-      <w:r>
-        <w:rPr>
-          <w:rStyle w:val="Emphasis"/>
-          <w:rFonts w:asciiTheme="majorHAnsi" w:hAnsiTheme="majorHAnsi" w:cstheme="majorHAnsi"/>
-          <w:i w:val="0"/>
-          <w:iCs w:val="0"/>
-          <w:sz w:val="21"/>
-          <w:szCs w:val="21"/>
-        </w:rPr>
         <w:t xml:space="preserve">What can I do to compensate was my </w:t>
       </w:r>
       <w:r>
@@ -6797,6 +6928,7 @@
           <w:sz w:val="21"/>
           <w:szCs w:val="21"/>
         </w:rPr>
+        <w:lastRenderedPageBreak/>
         <w:t>but they don't know,</w:t>
       </w:r>
       <w:r>
@@ -7219,6 +7351,61 @@
           <w:lang w:val="en-US"/>
         </w:rPr>
         <w:t>.</w:t>
+      </w:r>
+    </w:p>
+    <w:p>
+      <w:pPr>
+        <w:pStyle w:val="NormalWeb"/>
+        <w:spacing w:before="240" w:beforeAutospacing="0" w:after="0" w:afterAutospacing="0"/>
+        <w:rPr>
+          <w:rStyle w:val="Emphasis"/>
+          <w:rFonts w:asciiTheme="majorHAnsi" w:hAnsiTheme="majorHAnsi" w:cstheme="majorHAnsi"/>
+          <w:i w:val="0"/>
+          <w:iCs w:val="0"/>
+          <w:sz w:val="21"/>
+          <w:szCs w:val="21"/>
+          <w:lang w:val="en-US"/>
+        </w:rPr>
+      </w:pPr>
+    </w:p>
+    <w:p>
+      <w:pPr>
+        <w:pStyle w:val="NormalWeb"/>
+        <w:spacing w:before="240" w:beforeAutospacing="0" w:after="0" w:afterAutospacing="0"/>
+        <w:rPr>
+          <w:rStyle w:val="Emphasis"/>
+          <w:rFonts w:asciiTheme="majorHAnsi" w:hAnsiTheme="majorHAnsi" w:cstheme="majorHAnsi"/>
+          <w:i w:val="0"/>
+          <w:iCs w:val="0"/>
+          <w:sz w:val="21"/>
+          <w:szCs w:val="21"/>
+          <w:lang w:val="en-US"/>
+        </w:rPr>
+      </w:pPr>
+    </w:p>
+    <w:p>
+      <w:pPr>
+        <w:pStyle w:val="NormalWeb"/>
+        <w:spacing w:before="240" w:beforeAutospacing="0" w:after="0" w:afterAutospacing="0"/>
+        <w:rPr>
+          <w:rStyle w:val="Emphasis"/>
+          <w:rFonts w:asciiTheme="majorHAnsi" w:hAnsiTheme="majorHAnsi" w:cstheme="majorHAnsi"/>
+          <w:sz w:val="21"/>
+          <w:szCs w:val="21"/>
+          <w:lang w:val="en-US"/>
+        </w:rPr>
+      </w:pPr>
+      <w:r>
+        <w:rPr>
+          <w:rStyle w:val="Emphasis"/>
+          <w:rFonts w:asciiTheme="majorHAnsi" w:hAnsiTheme="majorHAnsi" w:cstheme="majorHAnsi"/>
+          <w:sz w:val="21"/>
+          <w:szCs w:val="21"/>
+          <w:highlight w:val="darkCyan"/>
+          <w:lang w:val="en-US"/>
+        </w:rPr>
+        <w:lastRenderedPageBreak/>
+        <w:t>Voices is motivated by the versions of me in my head, some die, some get quiet, some come to life and the cycle continues</w:t>
       </w:r>
     </w:p>
     <w:p>
@@ -7439,147 +7626,158 @@
           <w:szCs w:val="21"/>
           <w:lang w:val="en-US"/>
         </w:rPr>
+        <w:t xml:space="preserve">It reminds me of someone I used to know </w:t>
+      </w:r>
+      <w:r>
+        <w:rPr>
+          <w:rStyle w:val="Emphasis"/>
+          <w:rFonts w:asciiTheme="majorHAnsi" w:hAnsiTheme="majorHAnsi" w:cstheme="majorHAnsi"/>
+          <w:i w:val="0"/>
+          <w:iCs w:val="0"/>
+          <w:sz w:val="21"/>
+          <w:szCs w:val="21"/>
+          <w:lang w:val="en-US"/>
+        </w:rPr>
+        <w:br/>
+        <w:t>Who was bipolar,</w:t>
+      </w:r>
+      <w:r>
+        <w:rPr>
+          <w:rStyle w:val="Emphasis"/>
+          <w:rFonts w:asciiTheme="majorHAnsi" w:hAnsiTheme="majorHAnsi" w:cstheme="majorHAnsi"/>
+          <w:i w:val="0"/>
+          <w:iCs w:val="0"/>
+          <w:sz w:val="21"/>
+          <w:szCs w:val="21"/>
+          <w:lang w:val="en-US"/>
+        </w:rPr>
+        <w:t xml:space="preserve"> </w:t>
+      </w:r>
+      <w:r>
+        <w:rPr>
+          <w:rStyle w:val="Emphasis"/>
+          <w:rFonts w:asciiTheme="majorHAnsi" w:hAnsiTheme="majorHAnsi" w:cstheme="majorHAnsi"/>
+          <w:i w:val="0"/>
+          <w:iCs w:val="0"/>
+          <w:sz w:val="21"/>
+          <w:szCs w:val="21"/>
+          <w:lang w:val="en-US"/>
+        </w:rPr>
+        <w:t>no?</w:t>
+      </w:r>
+      <w:r>
+        <w:rPr>
+          <w:rStyle w:val="Emphasis"/>
+          <w:rFonts w:asciiTheme="majorHAnsi" w:hAnsiTheme="majorHAnsi" w:cstheme="majorHAnsi"/>
+          <w:i w:val="0"/>
+          <w:iCs w:val="0"/>
+          <w:sz w:val="21"/>
+          <w:szCs w:val="21"/>
+          <w:lang w:val="en-US"/>
+        </w:rPr>
+        <w:br/>
+        <w:t>He had sides,</w:t>
+      </w:r>
+      <w:r>
+        <w:rPr>
+          <w:rStyle w:val="Emphasis"/>
+          <w:rFonts w:asciiTheme="majorHAnsi" w:hAnsiTheme="majorHAnsi" w:cstheme="majorHAnsi"/>
+          <w:i w:val="0"/>
+          <w:iCs w:val="0"/>
+          <w:sz w:val="21"/>
+          <w:szCs w:val="21"/>
+          <w:lang w:val="en-US"/>
+        </w:rPr>
+        <w:t xml:space="preserve"> </w:t>
+      </w:r>
+      <w:r>
+        <w:rPr>
+          <w:rStyle w:val="Emphasis"/>
+          <w:rFonts w:asciiTheme="majorHAnsi" w:hAnsiTheme="majorHAnsi" w:cstheme="majorHAnsi"/>
+          <w:i w:val="0"/>
+          <w:iCs w:val="0"/>
+          <w:sz w:val="21"/>
+          <w:szCs w:val="21"/>
+          <w:lang w:val="en-US"/>
+        </w:rPr>
+        <w:t>so?</w:t>
+      </w:r>
+      <w:r>
+        <w:rPr>
+          <w:rStyle w:val="Emphasis"/>
+          <w:rFonts w:asciiTheme="majorHAnsi" w:hAnsiTheme="majorHAnsi" w:cstheme="majorHAnsi"/>
+          <w:i w:val="0"/>
+          <w:iCs w:val="0"/>
+          <w:sz w:val="21"/>
+          <w:szCs w:val="21"/>
+          <w:lang w:val="en-US"/>
+        </w:rPr>
+        <w:br/>
+        <w:t>I'd love to attend in his head, the meetings</w:t>
+      </w:r>
+    </w:p>
+    <w:p>
+      <w:pPr>
+        <w:pStyle w:val="NormalWeb"/>
+        <w:spacing w:before="240" w:beforeAutospacing="0" w:after="0" w:afterAutospacing="0"/>
+        <w:rPr>
+          <w:rStyle w:val="Emphasis"/>
+          <w:rFonts w:asciiTheme="majorHAnsi" w:hAnsiTheme="majorHAnsi" w:cstheme="majorHAnsi"/>
+          <w:i w:val="0"/>
+          <w:iCs w:val="0"/>
+          <w:sz w:val="21"/>
+          <w:szCs w:val="21"/>
+          <w:lang w:val="en-US"/>
+        </w:rPr>
+      </w:pPr>
+      <w:r>
+        <w:rPr>
+          <w:rStyle w:val="Emphasis"/>
+          <w:rFonts w:asciiTheme="majorHAnsi" w:hAnsiTheme="majorHAnsi" w:cstheme="majorHAnsi"/>
+          <w:i w:val="0"/>
+          <w:iCs w:val="0"/>
+          <w:sz w:val="21"/>
+          <w:szCs w:val="21"/>
+          <w:lang w:val="en-US"/>
+        </w:rPr>
+        <w:t xml:space="preserve">But time has passed so much </w:t>
+      </w:r>
+      <w:r>
+        <w:rPr>
+          <w:rStyle w:val="Emphasis"/>
+          <w:rFonts w:asciiTheme="majorHAnsi" w:hAnsiTheme="majorHAnsi" w:cstheme="majorHAnsi"/>
+          <w:i w:val="0"/>
+          <w:iCs w:val="0"/>
+          <w:sz w:val="21"/>
+          <w:szCs w:val="21"/>
+          <w:lang w:val="en-US"/>
+        </w:rPr>
+        <w:br/>
+        <w:t>And you don't write back that much</w:t>
+      </w:r>
+      <w:r>
+        <w:rPr>
+          <w:rStyle w:val="Emphasis"/>
+          <w:rFonts w:asciiTheme="majorHAnsi" w:hAnsiTheme="majorHAnsi" w:cstheme="majorHAnsi"/>
+          <w:i w:val="0"/>
+          <w:iCs w:val="0"/>
+          <w:sz w:val="21"/>
+          <w:szCs w:val="21"/>
+          <w:lang w:val="en-US"/>
+        </w:rPr>
+        <w:br/>
+      </w:r>
+      <w:r>
+        <w:rPr>
+          <w:rStyle w:val="Emphasis"/>
+          <w:rFonts w:asciiTheme="majorHAnsi" w:hAnsiTheme="majorHAnsi" w:cstheme="majorHAnsi"/>
+          <w:i w:val="0"/>
+          <w:iCs w:val="0"/>
+          <w:sz w:val="21"/>
+          <w:szCs w:val="21"/>
+          <w:lang w:val="en-US"/>
+        </w:rPr>
         <w:lastRenderedPageBreak/>
-        <w:t xml:space="preserve">It reminds me of someone I used to know </w:t>
-      </w:r>
-      <w:r>
-        <w:rPr>
-          <w:rStyle w:val="Emphasis"/>
-          <w:rFonts w:asciiTheme="majorHAnsi" w:hAnsiTheme="majorHAnsi" w:cstheme="majorHAnsi"/>
-          <w:i w:val="0"/>
-          <w:iCs w:val="0"/>
-          <w:sz w:val="21"/>
-          <w:szCs w:val="21"/>
-          <w:lang w:val="en-US"/>
-        </w:rPr>
-        <w:br/>
-        <w:t>Who was bipolar,</w:t>
-      </w:r>
-      <w:r>
-        <w:rPr>
-          <w:rStyle w:val="Emphasis"/>
-          <w:rFonts w:asciiTheme="majorHAnsi" w:hAnsiTheme="majorHAnsi" w:cstheme="majorHAnsi"/>
-          <w:i w:val="0"/>
-          <w:iCs w:val="0"/>
-          <w:sz w:val="21"/>
-          <w:szCs w:val="21"/>
-          <w:lang w:val="en-US"/>
-        </w:rPr>
-        <w:t xml:space="preserve"> </w:t>
-      </w:r>
-      <w:r>
-        <w:rPr>
-          <w:rStyle w:val="Emphasis"/>
-          <w:rFonts w:asciiTheme="majorHAnsi" w:hAnsiTheme="majorHAnsi" w:cstheme="majorHAnsi"/>
-          <w:i w:val="0"/>
-          <w:iCs w:val="0"/>
-          <w:sz w:val="21"/>
-          <w:szCs w:val="21"/>
-          <w:lang w:val="en-US"/>
-        </w:rPr>
-        <w:t>no?</w:t>
-      </w:r>
-      <w:r>
-        <w:rPr>
-          <w:rStyle w:val="Emphasis"/>
-          <w:rFonts w:asciiTheme="majorHAnsi" w:hAnsiTheme="majorHAnsi" w:cstheme="majorHAnsi"/>
-          <w:i w:val="0"/>
-          <w:iCs w:val="0"/>
-          <w:sz w:val="21"/>
-          <w:szCs w:val="21"/>
-          <w:lang w:val="en-US"/>
-        </w:rPr>
-        <w:br/>
-        <w:t>He had sides,</w:t>
-      </w:r>
-      <w:r>
-        <w:rPr>
-          <w:rStyle w:val="Emphasis"/>
-          <w:rFonts w:asciiTheme="majorHAnsi" w:hAnsiTheme="majorHAnsi" w:cstheme="majorHAnsi"/>
-          <w:i w:val="0"/>
-          <w:iCs w:val="0"/>
-          <w:sz w:val="21"/>
-          <w:szCs w:val="21"/>
-          <w:lang w:val="en-US"/>
-        </w:rPr>
-        <w:t xml:space="preserve"> </w:t>
-      </w:r>
-      <w:r>
-        <w:rPr>
-          <w:rStyle w:val="Emphasis"/>
-          <w:rFonts w:asciiTheme="majorHAnsi" w:hAnsiTheme="majorHAnsi" w:cstheme="majorHAnsi"/>
-          <w:i w:val="0"/>
-          <w:iCs w:val="0"/>
-          <w:sz w:val="21"/>
-          <w:szCs w:val="21"/>
-          <w:lang w:val="en-US"/>
-        </w:rPr>
-        <w:t>so?</w:t>
-      </w:r>
-      <w:r>
-        <w:rPr>
-          <w:rStyle w:val="Emphasis"/>
-          <w:rFonts w:asciiTheme="majorHAnsi" w:hAnsiTheme="majorHAnsi" w:cstheme="majorHAnsi"/>
-          <w:i w:val="0"/>
-          <w:iCs w:val="0"/>
-          <w:sz w:val="21"/>
-          <w:szCs w:val="21"/>
-          <w:lang w:val="en-US"/>
-        </w:rPr>
-        <w:br/>
-        <w:t>I'd love to attend in his head, the meetings</w:t>
-      </w:r>
-    </w:p>
-    <w:p>
-      <w:pPr>
-        <w:pStyle w:val="NormalWeb"/>
-        <w:spacing w:before="240" w:beforeAutospacing="0" w:after="0" w:afterAutospacing="0"/>
-        <w:rPr>
-          <w:rStyle w:val="Emphasis"/>
-          <w:rFonts w:asciiTheme="majorHAnsi" w:hAnsiTheme="majorHAnsi" w:cstheme="majorHAnsi"/>
-          <w:i w:val="0"/>
-          <w:iCs w:val="0"/>
-          <w:sz w:val="21"/>
-          <w:szCs w:val="21"/>
-          <w:lang w:val="en-US"/>
-        </w:rPr>
-      </w:pPr>
-      <w:r>
-        <w:rPr>
-          <w:rStyle w:val="Emphasis"/>
-          <w:rFonts w:asciiTheme="majorHAnsi" w:hAnsiTheme="majorHAnsi" w:cstheme="majorHAnsi"/>
-          <w:i w:val="0"/>
-          <w:iCs w:val="0"/>
-          <w:sz w:val="21"/>
-          <w:szCs w:val="21"/>
-          <w:lang w:val="en-US"/>
-        </w:rPr>
-        <w:t xml:space="preserve">But time has passed so much </w:t>
-      </w:r>
-      <w:r>
-        <w:rPr>
-          <w:rStyle w:val="Emphasis"/>
-          <w:rFonts w:asciiTheme="majorHAnsi" w:hAnsiTheme="majorHAnsi" w:cstheme="majorHAnsi"/>
-          <w:i w:val="0"/>
-          <w:iCs w:val="0"/>
-          <w:sz w:val="21"/>
-          <w:szCs w:val="21"/>
-          <w:lang w:val="en-US"/>
-        </w:rPr>
-        <w:br/>
-        <w:t>And you don't write back that much</w:t>
-      </w:r>
-      <w:r>
-        <w:rPr>
-          <w:rStyle w:val="Emphasis"/>
-          <w:rFonts w:asciiTheme="majorHAnsi" w:hAnsiTheme="majorHAnsi" w:cstheme="majorHAnsi"/>
-          <w:i w:val="0"/>
-          <w:iCs w:val="0"/>
-          <w:sz w:val="21"/>
-          <w:szCs w:val="21"/>
-          <w:lang w:val="en-US"/>
-        </w:rPr>
-        <w:br/>
         <w:t>Maybe you died and I'm stuffing your mail</w:t>
       </w:r>
       <w:r>
@@ -8004,6 +8202,7 @@
           <w:sz w:val="21"/>
           <w:szCs w:val="21"/>
         </w:rPr>
+        <w:lastRenderedPageBreak/>
         <w:t>Dressed in all black and tie</w:t>
       </w:r>
       <w:r>
@@ -8495,32 +8694,251 @@
           <w:szCs w:val="21"/>
           <w:lang w:val="en-US"/>
         </w:rPr>
+        <w:t>I feel like this was meant for a G</w:t>
+      </w:r>
+      <w:r>
+        <w:rPr>
+          <w:rStyle w:val="Emphasis"/>
+          <w:rFonts w:asciiTheme="majorHAnsi" w:hAnsiTheme="majorHAnsi" w:cstheme="majorHAnsi"/>
+          <w:i w:val="0"/>
+          <w:iCs w:val="0"/>
+          <w:sz w:val="21"/>
+          <w:szCs w:val="21"/>
+          <w:lang w:val="en-US"/>
+        </w:rPr>
+        <w:br/>
+      </w:r>
+      <w:r>
+        <w:rPr>
+          <w:rStyle w:val="Emphasis"/>
+          <w:rFonts w:asciiTheme="majorHAnsi" w:hAnsiTheme="majorHAnsi" w:cstheme="majorHAnsi"/>
+          <w:i w:val="0"/>
+          <w:iCs w:val="0"/>
+          <w:sz w:val="21"/>
+          <w:szCs w:val="21"/>
+          <w:lang w:val="en-US"/>
+        </w:rPr>
+        <w:t>Times passed and the excitement still tickles me</w:t>
+      </w:r>
+    </w:p>
+    <w:p>
+      <w:pPr>
+        <w:pStyle w:val="NormalWeb"/>
+        <w:spacing w:before="0" w:beforeAutospacing="0" w:after="240" w:afterAutospacing="0"/>
+        <w:rPr>
+          <w:rStyle w:val="Emphasis"/>
+          <w:rFonts w:asciiTheme="majorHAnsi" w:hAnsiTheme="majorHAnsi" w:cstheme="majorHAnsi"/>
+          <w:i w:val="0"/>
+          <w:iCs w:val="0"/>
+          <w:sz w:val="21"/>
+          <w:szCs w:val="21"/>
+          <w:lang w:val="en-US"/>
+        </w:rPr>
+      </w:pPr>
+      <w:r>
+        <w:rPr>
+          <w:rStyle w:val="Emphasis"/>
+          <w:rFonts w:asciiTheme="majorHAnsi" w:hAnsiTheme="majorHAnsi" w:cstheme="majorHAnsi"/>
+          <w:i w:val="0"/>
+          <w:iCs w:val="0"/>
+          <w:sz w:val="21"/>
+          <w:szCs w:val="21"/>
+          <w:lang w:val="en-US"/>
+        </w:rPr>
         <w:lastRenderedPageBreak/>
-        <w:t>I feel like this was meant for a G</w:t>
-      </w:r>
-      <w:r>
-        <w:rPr>
-          <w:rStyle w:val="Emphasis"/>
-          <w:rFonts w:asciiTheme="majorHAnsi" w:hAnsiTheme="majorHAnsi" w:cstheme="majorHAnsi"/>
-          <w:i w:val="0"/>
-          <w:iCs w:val="0"/>
-          <w:sz w:val="21"/>
-          <w:szCs w:val="21"/>
-          <w:lang w:val="en-US"/>
-        </w:rPr>
-        <w:br/>
-      </w:r>
-      <w:r>
-        <w:rPr>
-          <w:rStyle w:val="Emphasis"/>
-          <w:rFonts w:asciiTheme="majorHAnsi" w:hAnsiTheme="majorHAnsi" w:cstheme="majorHAnsi"/>
-          <w:i w:val="0"/>
-          <w:iCs w:val="0"/>
-          <w:sz w:val="21"/>
-          <w:szCs w:val="21"/>
-          <w:lang w:val="en-US"/>
-        </w:rPr>
-        <w:t>Times passed and the excitement still tickles me</w:t>
+        <w:t>When she sits far side sad from boredom of love</w:t>
+      </w:r>
+      <w:r>
+        <w:rPr>
+          <w:rStyle w:val="Emphasis"/>
+          <w:rFonts w:asciiTheme="majorHAnsi" w:hAnsiTheme="majorHAnsi" w:cstheme="majorHAnsi"/>
+          <w:i w:val="0"/>
+          <w:iCs w:val="0"/>
+          <w:sz w:val="21"/>
+          <w:szCs w:val="21"/>
+          <w:lang w:val="en-US"/>
+        </w:rPr>
+        <w:br/>
+      </w:r>
+      <w:r>
+        <w:rPr>
+          <w:rStyle w:val="Emphasis"/>
+          <w:rFonts w:asciiTheme="majorHAnsi" w:hAnsiTheme="majorHAnsi" w:cstheme="majorHAnsi"/>
+          <w:i w:val="0"/>
+          <w:iCs w:val="0"/>
+          <w:sz w:val="21"/>
+          <w:szCs w:val="21"/>
+          <w:lang w:val="en-US"/>
+        </w:rPr>
+        <w:t>The sadness brought by joy</w:t>
+      </w:r>
+      <w:r>
+        <w:rPr>
+          <w:rStyle w:val="Emphasis"/>
+          <w:rFonts w:asciiTheme="majorHAnsi" w:hAnsiTheme="majorHAnsi" w:cstheme="majorHAnsi"/>
+          <w:i w:val="0"/>
+          <w:iCs w:val="0"/>
+          <w:sz w:val="21"/>
+          <w:szCs w:val="21"/>
+          <w:lang w:val="en-US"/>
+        </w:rPr>
+        <w:br/>
+      </w:r>
+      <w:r>
+        <w:rPr>
+          <w:rStyle w:val="Emphasis"/>
+          <w:rFonts w:asciiTheme="majorHAnsi" w:hAnsiTheme="majorHAnsi" w:cstheme="majorHAnsi"/>
+          <w:i w:val="0"/>
+          <w:iCs w:val="0"/>
+          <w:sz w:val="21"/>
+          <w:szCs w:val="21"/>
+          <w:lang w:val="en-US"/>
+        </w:rPr>
+        <w:t>Afraid someone will jinx</w:t>
+      </w:r>
+      <w:r>
+        <w:rPr>
+          <w:rStyle w:val="Emphasis"/>
+          <w:rFonts w:asciiTheme="majorHAnsi" w:hAnsiTheme="majorHAnsi" w:cstheme="majorHAnsi"/>
+          <w:i w:val="0"/>
+          <w:iCs w:val="0"/>
+          <w:sz w:val="21"/>
+          <w:szCs w:val="21"/>
+          <w:lang w:val="en-US"/>
+        </w:rPr>
+        <w:br/>
+      </w:r>
+      <w:r>
+        <w:rPr>
+          <w:rStyle w:val="Emphasis"/>
+          <w:rFonts w:asciiTheme="majorHAnsi" w:hAnsiTheme="majorHAnsi" w:cstheme="majorHAnsi"/>
+          <w:i w:val="0"/>
+          <w:iCs w:val="0"/>
+          <w:sz w:val="21"/>
+          <w:szCs w:val="21"/>
+          <w:lang w:val="en-US"/>
+        </w:rPr>
+        <w:t>Her one sole heap of Joy</w:t>
+      </w:r>
+      <w:r>
+        <w:rPr>
+          <w:rStyle w:val="Emphasis"/>
+          <w:rFonts w:asciiTheme="majorHAnsi" w:hAnsiTheme="majorHAnsi" w:cstheme="majorHAnsi"/>
+          <w:i w:val="0"/>
+          <w:iCs w:val="0"/>
+          <w:sz w:val="21"/>
+          <w:szCs w:val="21"/>
+          <w:lang w:val="en-US"/>
+        </w:rPr>
+        <w:br/>
+      </w:r>
+      <w:r>
+        <w:rPr>
+          <w:rStyle w:val="Emphasis"/>
+          <w:rFonts w:asciiTheme="majorHAnsi" w:hAnsiTheme="majorHAnsi" w:cstheme="majorHAnsi"/>
+          <w:i w:val="0"/>
+          <w:iCs w:val="0"/>
+          <w:sz w:val="21"/>
+          <w:szCs w:val="21"/>
+          <w:lang w:val="en-US"/>
+        </w:rPr>
+        <w:t>But she's not just a toy</w:t>
+      </w:r>
+      <w:r>
+        <w:rPr>
+          <w:rStyle w:val="Emphasis"/>
+          <w:rFonts w:asciiTheme="majorHAnsi" w:hAnsiTheme="majorHAnsi" w:cstheme="majorHAnsi"/>
+          <w:i w:val="0"/>
+          <w:iCs w:val="0"/>
+          <w:sz w:val="21"/>
+          <w:szCs w:val="21"/>
+          <w:lang w:val="en-US"/>
+        </w:rPr>
+        <w:t xml:space="preserve">, </w:t>
+      </w:r>
+      <w:r>
+        <w:rPr>
+          <w:rStyle w:val="Emphasis"/>
+          <w:rFonts w:asciiTheme="majorHAnsi" w:hAnsiTheme="majorHAnsi" w:cstheme="majorHAnsi"/>
+          <w:i w:val="0"/>
+          <w:iCs w:val="0"/>
+          <w:sz w:val="21"/>
+          <w:szCs w:val="21"/>
+          <w:lang w:val="en-US"/>
+        </w:rPr>
+        <w:t xml:space="preserve">She's the gravity my world </w:t>
+      </w:r>
+      <w:r>
+        <w:rPr>
+          <w:rStyle w:val="Emphasis"/>
+          <w:rFonts w:asciiTheme="majorHAnsi" w:hAnsiTheme="majorHAnsi" w:cstheme="majorHAnsi"/>
+          <w:i w:val="0"/>
+          <w:iCs w:val="0"/>
+          <w:sz w:val="21"/>
+          <w:szCs w:val="21"/>
+          <w:lang w:val="en-US"/>
+        </w:rPr>
+        <w:t>centers</w:t>
+      </w:r>
+      <w:r>
+        <w:rPr>
+          <w:rStyle w:val="Emphasis"/>
+          <w:rFonts w:asciiTheme="majorHAnsi" w:hAnsiTheme="majorHAnsi" w:cstheme="majorHAnsi"/>
+          <w:i w:val="0"/>
+          <w:iCs w:val="0"/>
+          <w:sz w:val="21"/>
+          <w:szCs w:val="21"/>
+          <w:lang w:val="en-US"/>
+        </w:rPr>
+        <w:t xml:space="preserve"> upon </w:t>
+      </w:r>
+      <w:r>
+        <w:rPr>
+          <w:rStyle w:val="Emphasis"/>
+          <w:rFonts w:asciiTheme="majorHAnsi" w:hAnsiTheme="majorHAnsi" w:cstheme="majorHAnsi"/>
+          <w:i w:val="0"/>
+          <w:iCs w:val="0"/>
+          <w:sz w:val="21"/>
+          <w:szCs w:val="21"/>
+          <w:lang w:val="en-US"/>
+        </w:rPr>
+        <w:br/>
+      </w:r>
+      <w:r>
+        <w:rPr>
+          <w:rStyle w:val="Emphasis"/>
+          <w:rFonts w:asciiTheme="majorHAnsi" w:hAnsiTheme="majorHAnsi" w:cstheme="majorHAnsi"/>
+          <w:i w:val="0"/>
+          <w:iCs w:val="0"/>
+          <w:sz w:val="21"/>
+          <w:szCs w:val="21"/>
+          <w:lang w:val="en-US"/>
+        </w:rPr>
+        <w:t xml:space="preserve">The body my happiness orbits around </w:t>
+      </w:r>
+      <w:r>
+        <w:rPr>
+          <w:rStyle w:val="Emphasis"/>
+          <w:rFonts w:asciiTheme="majorHAnsi" w:hAnsiTheme="majorHAnsi" w:cstheme="majorHAnsi"/>
+          <w:i w:val="0"/>
+          <w:iCs w:val="0"/>
+          <w:sz w:val="21"/>
+          <w:szCs w:val="21"/>
+          <w:lang w:val="en-US"/>
+        </w:rPr>
+        <w:br/>
+      </w:r>
+      <w:r>
+        <w:rPr>
+          <w:rStyle w:val="Emphasis"/>
+          <w:rFonts w:asciiTheme="majorHAnsi" w:hAnsiTheme="majorHAnsi" w:cstheme="majorHAnsi"/>
+          <w:i w:val="0"/>
+          <w:iCs w:val="0"/>
+          <w:sz w:val="21"/>
+          <w:szCs w:val="21"/>
+          <w:lang w:val="en-US"/>
+        </w:rPr>
+        <w:t xml:space="preserve">Her love is tender and sound </w:t>
       </w:r>
     </w:p>
     <w:p>
@@ -8547,199 +8965,175 @@
           <w:szCs w:val="21"/>
           <w:lang w:val="en-US"/>
         </w:rPr>
-        <w:t>When she sits far side sad from boredom of love</w:t>
-      </w:r>
-      <w:r>
-        <w:rPr>
-          <w:rStyle w:val="Emphasis"/>
-          <w:rFonts w:asciiTheme="majorHAnsi" w:hAnsiTheme="majorHAnsi" w:cstheme="majorHAnsi"/>
-          <w:i w:val="0"/>
-          <w:iCs w:val="0"/>
-          <w:sz w:val="21"/>
-          <w:szCs w:val="21"/>
-          <w:lang w:val="en-US"/>
-        </w:rPr>
-        <w:br/>
-      </w:r>
-      <w:r>
-        <w:rPr>
-          <w:rStyle w:val="Emphasis"/>
-          <w:rFonts w:asciiTheme="majorHAnsi" w:hAnsiTheme="majorHAnsi" w:cstheme="majorHAnsi"/>
-          <w:i w:val="0"/>
-          <w:iCs w:val="0"/>
-          <w:sz w:val="21"/>
-          <w:szCs w:val="21"/>
-          <w:lang w:val="en-US"/>
-        </w:rPr>
-        <w:t>The sadness brought by joy</w:t>
-      </w:r>
-      <w:r>
-        <w:rPr>
-          <w:rStyle w:val="Emphasis"/>
-          <w:rFonts w:asciiTheme="majorHAnsi" w:hAnsiTheme="majorHAnsi" w:cstheme="majorHAnsi"/>
-          <w:i w:val="0"/>
-          <w:iCs w:val="0"/>
-          <w:sz w:val="21"/>
-          <w:szCs w:val="21"/>
-          <w:lang w:val="en-US"/>
-        </w:rPr>
-        <w:br/>
-      </w:r>
-      <w:r>
-        <w:rPr>
-          <w:rStyle w:val="Emphasis"/>
-          <w:rFonts w:asciiTheme="majorHAnsi" w:hAnsiTheme="majorHAnsi" w:cstheme="majorHAnsi"/>
-          <w:i w:val="0"/>
-          <w:iCs w:val="0"/>
-          <w:sz w:val="21"/>
-          <w:szCs w:val="21"/>
-          <w:lang w:val="en-US"/>
-        </w:rPr>
-        <w:t>Afraid someone will jinx</w:t>
-      </w:r>
-      <w:r>
-        <w:rPr>
-          <w:rStyle w:val="Emphasis"/>
-          <w:rFonts w:asciiTheme="majorHAnsi" w:hAnsiTheme="majorHAnsi" w:cstheme="majorHAnsi"/>
-          <w:i w:val="0"/>
-          <w:iCs w:val="0"/>
-          <w:sz w:val="21"/>
-          <w:szCs w:val="21"/>
-          <w:lang w:val="en-US"/>
-        </w:rPr>
-        <w:br/>
-      </w:r>
-      <w:r>
-        <w:rPr>
-          <w:rStyle w:val="Emphasis"/>
-          <w:rFonts w:asciiTheme="majorHAnsi" w:hAnsiTheme="majorHAnsi" w:cstheme="majorHAnsi"/>
-          <w:i w:val="0"/>
-          <w:iCs w:val="0"/>
-          <w:sz w:val="21"/>
-          <w:szCs w:val="21"/>
-          <w:lang w:val="en-US"/>
-        </w:rPr>
-        <w:t>Her one sole heap of Joy</w:t>
-      </w:r>
-      <w:r>
-        <w:rPr>
-          <w:rStyle w:val="Emphasis"/>
-          <w:rFonts w:asciiTheme="majorHAnsi" w:hAnsiTheme="majorHAnsi" w:cstheme="majorHAnsi"/>
-          <w:i w:val="0"/>
-          <w:iCs w:val="0"/>
-          <w:sz w:val="21"/>
-          <w:szCs w:val="21"/>
-          <w:lang w:val="en-US"/>
-        </w:rPr>
-        <w:br/>
-      </w:r>
-      <w:r>
-        <w:rPr>
-          <w:rStyle w:val="Emphasis"/>
-          <w:rFonts w:asciiTheme="majorHAnsi" w:hAnsiTheme="majorHAnsi" w:cstheme="majorHAnsi"/>
-          <w:i w:val="0"/>
-          <w:iCs w:val="0"/>
-          <w:sz w:val="21"/>
-          <w:szCs w:val="21"/>
-          <w:lang w:val="en-US"/>
-        </w:rPr>
-        <w:t>But she's not just a toy</w:t>
-      </w:r>
-      <w:r>
-        <w:rPr>
-          <w:rStyle w:val="Emphasis"/>
-          <w:rFonts w:asciiTheme="majorHAnsi" w:hAnsiTheme="majorHAnsi" w:cstheme="majorHAnsi"/>
-          <w:i w:val="0"/>
-          <w:iCs w:val="0"/>
-          <w:sz w:val="21"/>
-          <w:szCs w:val="21"/>
-          <w:lang w:val="en-US"/>
-        </w:rPr>
-        <w:t xml:space="preserve">, </w:t>
-      </w:r>
-      <w:r>
-        <w:rPr>
-          <w:rStyle w:val="Emphasis"/>
-          <w:rFonts w:asciiTheme="majorHAnsi" w:hAnsiTheme="majorHAnsi" w:cstheme="majorHAnsi"/>
-          <w:i w:val="0"/>
-          <w:iCs w:val="0"/>
-          <w:sz w:val="21"/>
-          <w:szCs w:val="21"/>
-          <w:lang w:val="en-US"/>
-        </w:rPr>
-        <w:t xml:space="preserve">She's the gravity my world </w:t>
-      </w:r>
-      <w:r>
-        <w:rPr>
-          <w:rStyle w:val="Emphasis"/>
-          <w:rFonts w:asciiTheme="majorHAnsi" w:hAnsiTheme="majorHAnsi" w:cstheme="majorHAnsi"/>
-          <w:i w:val="0"/>
-          <w:iCs w:val="0"/>
-          <w:sz w:val="21"/>
-          <w:szCs w:val="21"/>
-          <w:lang w:val="en-US"/>
-        </w:rPr>
-        <w:t>centers</w:t>
-      </w:r>
-      <w:r>
-        <w:rPr>
-          <w:rStyle w:val="Emphasis"/>
-          <w:rFonts w:asciiTheme="majorHAnsi" w:hAnsiTheme="majorHAnsi" w:cstheme="majorHAnsi"/>
-          <w:i w:val="0"/>
-          <w:iCs w:val="0"/>
-          <w:sz w:val="21"/>
-          <w:szCs w:val="21"/>
-          <w:lang w:val="en-US"/>
-        </w:rPr>
-        <w:t xml:space="preserve"> upon </w:t>
-      </w:r>
-      <w:r>
-        <w:rPr>
-          <w:rStyle w:val="Emphasis"/>
-          <w:rFonts w:asciiTheme="majorHAnsi" w:hAnsiTheme="majorHAnsi" w:cstheme="majorHAnsi"/>
-          <w:i w:val="0"/>
-          <w:iCs w:val="0"/>
-          <w:sz w:val="21"/>
-          <w:szCs w:val="21"/>
-          <w:lang w:val="en-US"/>
-        </w:rPr>
-        <w:br/>
-      </w:r>
-      <w:r>
-        <w:rPr>
-          <w:rStyle w:val="Emphasis"/>
-          <w:rFonts w:asciiTheme="majorHAnsi" w:hAnsiTheme="majorHAnsi" w:cstheme="majorHAnsi"/>
-          <w:i w:val="0"/>
-          <w:iCs w:val="0"/>
-          <w:sz w:val="21"/>
-          <w:szCs w:val="21"/>
-          <w:lang w:val="en-US"/>
-        </w:rPr>
-        <w:t xml:space="preserve">The body my happiness orbits around </w:t>
-      </w:r>
-      <w:r>
-        <w:rPr>
-          <w:rStyle w:val="Emphasis"/>
-          <w:rFonts w:asciiTheme="majorHAnsi" w:hAnsiTheme="majorHAnsi" w:cstheme="majorHAnsi"/>
-          <w:i w:val="0"/>
-          <w:iCs w:val="0"/>
-          <w:sz w:val="21"/>
-          <w:szCs w:val="21"/>
-          <w:lang w:val="en-US"/>
-        </w:rPr>
-        <w:br/>
-      </w:r>
-      <w:r>
-        <w:rPr>
-          <w:rStyle w:val="Emphasis"/>
-          <w:rFonts w:asciiTheme="majorHAnsi" w:hAnsiTheme="majorHAnsi" w:cstheme="majorHAnsi"/>
-          <w:i w:val="0"/>
-          <w:iCs w:val="0"/>
-          <w:sz w:val="21"/>
-          <w:szCs w:val="21"/>
-          <w:lang w:val="en-US"/>
-        </w:rPr>
-        <w:t xml:space="preserve">Her love is tender and sound </w:t>
+        <w:t>And her eyes mixture of cheeky and bold</w:t>
+      </w:r>
+      <w:r>
+        <w:rPr>
+          <w:rStyle w:val="Emphasis"/>
+          <w:rFonts w:asciiTheme="majorHAnsi" w:hAnsiTheme="majorHAnsi" w:cstheme="majorHAnsi"/>
+          <w:i w:val="0"/>
+          <w:iCs w:val="0"/>
+          <w:sz w:val="21"/>
+          <w:szCs w:val="21"/>
+          <w:lang w:val="en-US"/>
+        </w:rPr>
+        <w:br/>
+      </w:r>
+      <w:r>
+        <w:rPr>
+          <w:rStyle w:val="Emphasis"/>
+          <w:rFonts w:asciiTheme="majorHAnsi" w:hAnsiTheme="majorHAnsi" w:cstheme="majorHAnsi"/>
+          <w:i w:val="0"/>
+          <w:iCs w:val="0"/>
+          <w:sz w:val="21"/>
+          <w:szCs w:val="21"/>
+          <w:lang w:val="en-US"/>
+        </w:rPr>
+        <w:t>I don't know what to make of it</w:t>
+      </w:r>
+      <w:r>
+        <w:rPr>
+          <w:rStyle w:val="Emphasis"/>
+          <w:rFonts w:asciiTheme="majorHAnsi" w:hAnsiTheme="majorHAnsi" w:cstheme="majorHAnsi"/>
+          <w:i w:val="0"/>
+          <w:iCs w:val="0"/>
+          <w:sz w:val="21"/>
+          <w:szCs w:val="21"/>
+          <w:lang w:val="en-US"/>
+        </w:rPr>
+        <w:br/>
+      </w:r>
+      <w:r>
+        <w:rPr>
+          <w:rStyle w:val="Emphasis"/>
+          <w:rFonts w:asciiTheme="majorHAnsi" w:hAnsiTheme="majorHAnsi" w:cstheme="majorHAnsi"/>
+          <w:i w:val="0"/>
+          <w:iCs w:val="0"/>
+          <w:sz w:val="21"/>
+          <w:szCs w:val="21"/>
+          <w:lang w:val="en-US"/>
+        </w:rPr>
+        <w:t>It's resemblance I can't hold</w:t>
+      </w:r>
+      <w:r>
+        <w:rPr>
+          <w:rStyle w:val="Emphasis"/>
+          <w:rFonts w:asciiTheme="majorHAnsi" w:hAnsiTheme="majorHAnsi" w:cstheme="majorHAnsi"/>
+          <w:i w:val="0"/>
+          <w:iCs w:val="0"/>
+          <w:sz w:val="21"/>
+          <w:szCs w:val="21"/>
+          <w:lang w:val="en-US"/>
+        </w:rPr>
+        <w:br/>
+      </w:r>
+      <w:r>
+        <w:rPr>
+          <w:rStyle w:val="Emphasis"/>
+          <w:rFonts w:asciiTheme="majorHAnsi" w:hAnsiTheme="majorHAnsi" w:cstheme="majorHAnsi"/>
+          <w:i w:val="0"/>
+          <w:iCs w:val="0"/>
+          <w:sz w:val="21"/>
+          <w:szCs w:val="21"/>
+          <w:lang w:val="en-US"/>
+        </w:rPr>
+        <w:t>Remember when we were younger and thought we were stronger?</w:t>
+      </w:r>
+      <w:r>
+        <w:rPr>
+          <w:rStyle w:val="Emphasis"/>
+          <w:rFonts w:asciiTheme="majorHAnsi" w:hAnsiTheme="majorHAnsi" w:cstheme="majorHAnsi"/>
+          <w:i w:val="0"/>
+          <w:iCs w:val="0"/>
+          <w:sz w:val="21"/>
+          <w:szCs w:val="21"/>
+          <w:lang w:val="en-US"/>
+        </w:rPr>
+        <w:br/>
+      </w:r>
+      <w:r>
+        <w:rPr>
+          <w:rStyle w:val="Emphasis"/>
+          <w:rFonts w:asciiTheme="majorHAnsi" w:hAnsiTheme="majorHAnsi" w:cstheme="majorHAnsi"/>
+          <w:i w:val="0"/>
+          <w:iCs w:val="0"/>
+          <w:sz w:val="21"/>
+          <w:szCs w:val="21"/>
+          <w:lang w:val="en-US"/>
+        </w:rPr>
+        <w:t>Two boys in one body,</w:t>
+      </w:r>
+      <w:r>
+        <w:rPr>
+          <w:rStyle w:val="Emphasis"/>
+          <w:rFonts w:asciiTheme="majorHAnsi" w:hAnsiTheme="majorHAnsi" w:cstheme="majorHAnsi"/>
+          <w:i w:val="0"/>
+          <w:iCs w:val="0"/>
+          <w:sz w:val="21"/>
+          <w:szCs w:val="21"/>
+          <w:lang w:val="en-US"/>
+        </w:rPr>
+        <w:t xml:space="preserve"> </w:t>
+      </w:r>
+      <w:r>
+        <w:rPr>
+          <w:rStyle w:val="Emphasis"/>
+          <w:rFonts w:asciiTheme="majorHAnsi" w:hAnsiTheme="majorHAnsi" w:cstheme="majorHAnsi"/>
+          <w:i w:val="0"/>
+          <w:iCs w:val="0"/>
+          <w:sz w:val="21"/>
+          <w:szCs w:val="21"/>
+          <w:lang w:val="en-US"/>
+        </w:rPr>
+        <w:t>fuck it,</w:t>
+      </w:r>
+      <w:r>
+        <w:rPr>
+          <w:rStyle w:val="Emphasis"/>
+          <w:rFonts w:asciiTheme="majorHAnsi" w:hAnsiTheme="majorHAnsi" w:cstheme="majorHAnsi"/>
+          <w:i w:val="0"/>
+          <w:iCs w:val="0"/>
+          <w:sz w:val="21"/>
+          <w:szCs w:val="21"/>
+          <w:lang w:val="en-US"/>
+        </w:rPr>
+        <w:br/>
+      </w:r>
+      <w:r>
+        <w:rPr>
+          <w:rStyle w:val="Emphasis"/>
+          <w:rFonts w:asciiTheme="majorHAnsi" w:hAnsiTheme="majorHAnsi" w:cstheme="majorHAnsi"/>
+          <w:i w:val="0"/>
+          <w:iCs w:val="0"/>
+          <w:sz w:val="21"/>
+          <w:szCs w:val="21"/>
+          <w:lang w:val="en-US"/>
+        </w:rPr>
+        <w:t xml:space="preserve">It </w:t>
+      </w:r>
+      <w:r>
+        <w:rPr>
+          <w:rStyle w:val="Emphasis"/>
+          <w:rFonts w:asciiTheme="majorHAnsi" w:hAnsiTheme="majorHAnsi" w:cstheme="majorHAnsi"/>
+          <w:i w:val="0"/>
+          <w:iCs w:val="0"/>
+          <w:sz w:val="21"/>
+          <w:szCs w:val="21"/>
+          <w:lang w:val="en-US"/>
+        </w:rPr>
+        <w:t>was</w:t>
+      </w:r>
+      <w:r>
+        <w:rPr>
+          <w:rStyle w:val="Emphasis"/>
+          <w:rFonts w:asciiTheme="majorHAnsi" w:hAnsiTheme="majorHAnsi" w:cstheme="majorHAnsi"/>
+          <w:i w:val="0"/>
+          <w:iCs w:val="0"/>
+          <w:sz w:val="21"/>
+          <w:szCs w:val="21"/>
+          <w:lang w:val="en-US"/>
+        </w:rPr>
+        <w:t xml:space="preserve"> fire.</w:t>
       </w:r>
     </w:p>
     <w:p>
@@ -8766,103 +9160,58 @@
           <w:szCs w:val="21"/>
           <w:lang w:val="en-US"/>
         </w:rPr>
-        <w:t>And her eyes mixture of cheeky and bold</w:t>
-      </w:r>
-      <w:r>
-        <w:rPr>
-          <w:rStyle w:val="Emphasis"/>
-          <w:rFonts w:asciiTheme="majorHAnsi" w:hAnsiTheme="majorHAnsi" w:cstheme="majorHAnsi"/>
-          <w:i w:val="0"/>
-          <w:iCs w:val="0"/>
-          <w:sz w:val="21"/>
-          <w:szCs w:val="21"/>
-          <w:lang w:val="en-US"/>
-        </w:rPr>
-        <w:br/>
-      </w:r>
-      <w:r>
-        <w:rPr>
-          <w:rStyle w:val="Emphasis"/>
-          <w:rFonts w:asciiTheme="majorHAnsi" w:hAnsiTheme="majorHAnsi" w:cstheme="majorHAnsi"/>
-          <w:i w:val="0"/>
-          <w:iCs w:val="0"/>
-          <w:sz w:val="21"/>
-          <w:szCs w:val="21"/>
-          <w:lang w:val="en-US"/>
-        </w:rPr>
-        <w:t>I don't know what to make of it</w:t>
-      </w:r>
-      <w:r>
-        <w:rPr>
-          <w:rStyle w:val="Emphasis"/>
-          <w:rFonts w:asciiTheme="majorHAnsi" w:hAnsiTheme="majorHAnsi" w:cstheme="majorHAnsi"/>
-          <w:i w:val="0"/>
-          <w:iCs w:val="0"/>
-          <w:sz w:val="21"/>
-          <w:szCs w:val="21"/>
-          <w:lang w:val="en-US"/>
-        </w:rPr>
-        <w:br/>
-      </w:r>
-      <w:r>
-        <w:rPr>
-          <w:rStyle w:val="Emphasis"/>
-          <w:rFonts w:asciiTheme="majorHAnsi" w:hAnsiTheme="majorHAnsi" w:cstheme="majorHAnsi"/>
-          <w:i w:val="0"/>
-          <w:iCs w:val="0"/>
-          <w:sz w:val="21"/>
-          <w:szCs w:val="21"/>
-          <w:lang w:val="en-US"/>
-        </w:rPr>
-        <w:t>It's resemblance I can't hold</w:t>
-      </w:r>
-      <w:r>
-        <w:rPr>
-          <w:rStyle w:val="Emphasis"/>
-          <w:rFonts w:asciiTheme="majorHAnsi" w:hAnsiTheme="majorHAnsi" w:cstheme="majorHAnsi"/>
-          <w:i w:val="0"/>
-          <w:iCs w:val="0"/>
-          <w:sz w:val="21"/>
-          <w:szCs w:val="21"/>
-          <w:lang w:val="en-US"/>
-        </w:rPr>
-        <w:br/>
-      </w:r>
-      <w:r>
-        <w:rPr>
-          <w:rStyle w:val="Emphasis"/>
-          <w:rFonts w:asciiTheme="majorHAnsi" w:hAnsiTheme="majorHAnsi" w:cstheme="majorHAnsi"/>
-          <w:i w:val="0"/>
-          <w:iCs w:val="0"/>
-          <w:sz w:val="21"/>
-          <w:szCs w:val="21"/>
-          <w:lang w:val="en-US"/>
-        </w:rPr>
-        <w:t>Remember when we were younger and thought we were stronger?</w:t>
-      </w:r>
-      <w:r>
-        <w:rPr>
-          <w:rStyle w:val="Emphasis"/>
-          <w:rFonts w:asciiTheme="majorHAnsi" w:hAnsiTheme="majorHAnsi" w:cstheme="majorHAnsi"/>
-          <w:i w:val="0"/>
-          <w:iCs w:val="0"/>
-          <w:sz w:val="21"/>
-          <w:szCs w:val="21"/>
-          <w:lang w:val="en-US"/>
-        </w:rPr>
-        <w:br/>
-      </w:r>
-      <w:r>
-        <w:rPr>
-          <w:rStyle w:val="Emphasis"/>
-          <w:rFonts w:asciiTheme="majorHAnsi" w:hAnsiTheme="majorHAnsi" w:cstheme="majorHAnsi"/>
-          <w:i w:val="0"/>
-          <w:iCs w:val="0"/>
-          <w:sz w:val="21"/>
-          <w:szCs w:val="21"/>
-          <w:lang w:val="en-US"/>
-        </w:rPr>
-        <w:t>Two boys in one body,</w:t>
+        <w:t xml:space="preserve">When you left, it became quiet...you quit...could have said you were </w:t>
+      </w:r>
+      <w:r>
+        <w:rPr>
+          <w:rStyle w:val="Emphasis"/>
+          <w:rFonts w:asciiTheme="majorHAnsi" w:hAnsiTheme="majorHAnsi" w:cstheme="majorHAnsi"/>
+          <w:i w:val="0"/>
+          <w:iCs w:val="0"/>
+          <w:sz w:val="21"/>
+          <w:szCs w:val="21"/>
+          <w:lang w:val="en-US"/>
+        </w:rPr>
+        <w:t xml:space="preserve">tired, </w:t>
+      </w:r>
+      <w:r>
+        <w:rPr>
+          <w:rStyle w:val="Emphasis"/>
+          <w:rFonts w:asciiTheme="majorHAnsi" w:hAnsiTheme="majorHAnsi" w:cstheme="majorHAnsi"/>
+          <w:i w:val="0"/>
+          <w:iCs w:val="0"/>
+          <w:sz w:val="21"/>
+          <w:szCs w:val="21"/>
+          <w:lang w:val="en-US"/>
+        </w:rPr>
+        <w:t xml:space="preserve">all the world felt lonely </w:t>
+      </w:r>
+    </w:p>
+    <w:p>
+      <w:pPr>
+        <w:pStyle w:val="NormalWeb"/>
+        <w:spacing w:before="0" w:beforeAutospacing="0" w:after="240" w:afterAutospacing="0"/>
+        <w:rPr>
+          <w:rStyle w:val="Emphasis"/>
+          <w:rFonts w:asciiTheme="majorHAnsi" w:hAnsiTheme="majorHAnsi" w:cstheme="majorHAnsi"/>
+          <w:i w:val="0"/>
+          <w:iCs w:val="0"/>
+          <w:sz w:val="21"/>
+          <w:szCs w:val="21"/>
+          <w:lang w:val="en-US"/>
+        </w:rPr>
+      </w:pPr>
+      <w:r>
+        <w:rPr>
+          <w:rStyle w:val="Emphasis"/>
+          <w:rFonts w:asciiTheme="majorHAnsi" w:hAnsiTheme="majorHAnsi" w:cstheme="majorHAnsi"/>
+          <w:i w:val="0"/>
+          <w:iCs w:val="0"/>
+          <w:sz w:val="21"/>
+          <w:szCs w:val="21"/>
+          <w:lang w:val="en-US"/>
+        </w:rPr>
+        <w:t>Then she came through my hero,</w:t>
       </w:r>
       <w:r>
         <w:rPr>
@@ -8886,55 +9235,19 @@
           <w:szCs w:val="21"/>
           <w:lang w:val="en-US"/>
         </w:rPr>
-        <w:t>fuck it,</w:t>
-      </w:r>
-      <w:r>
-        <w:rPr>
-          <w:rStyle w:val="Emphasis"/>
-          <w:rFonts w:asciiTheme="majorHAnsi" w:hAnsiTheme="majorHAnsi" w:cstheme="majorHAnsi"/>
-          <w:i w:val="0"/>
-          <w:iCs w:val="0"/>
-          <w:sz w:val="21"/>
-          <w:szCs w:val="21"/>
-          <w:lang w:val="en-US"/>
-        </w:rPr>
-        <w:br/>
-      </w:r>
-      <w:r>
-        <w:rPr>
-          <w:rStyle w:val="Emphasis"/>
-          <w:rFonts w:asciiTheme="majorHAnsi" w:hAnsiTheme="majorHAnsi" w:cstheme="majorHAnsi"/>
-          <w:i w:val="0"/>
-          <w:iCs w:val="0"/>
-          <w:sz w:val="21"/>
-          <w:szCs w:val="21"/>
-          <w:lang w:val="en-US"/>
-        </w:rPr>
-        <w:t xml:space="preserve">It </w:t>
-      </w:r>
-      <w:r>
-        <w:rPr>
-          <w:rStyle w:val="Emphasis"/>
-          <w:rFonts w:asciiTheme="majorHAnsi" w:hAnsiTheme="majorHAnsi" w:cstheme="majorHAnsi"/>
-          <w:i w:val="0"/>
-          <w:iCs w:val="0"/>
-          <w:sz w:val="21"/>
-          <w:szCs w:val="21"/>
-          <w:lang w:val="en-US"/>
-        </w:rPr>
-        <w:t>was</w:t>
-      </w:r>
-      <w:r>
-        <w:rPr>
-          <w:rStyle w:val="Emphasis"/>
-          <w:rFonts w:asciiTheme="majorHAnsi" w:hAnsiTheme="majorHAnsi" w:cstheme="majorHAnsi"/>
-          <w:i w:val="0"/>
-          <w:iCs w:val="0"/>
-          <w:sz w:val="21"/>
-          <w:szCs w:val="21"/>
-          <w:lang w:val="en-US"/>
-        </w:rPr>
-        <w:t xml:space="preserve"> fire.</w:t>
+        <w:t>she gets me...just so you know I don't blame you, feels like you paved the way...phew!</w:t>
+      </w:r>
+      <w:r>
+        <w:rPr>
+          <w:rStyle w:val="Emphasis"/>
+          <w:rFonts w:asciiTheme="majorHAnsi" w:hAnsiTheme="majorHAnsi" w:cstheme="majorHAnsi"/>
+          <w:i w:val="0"/>
+          <w:iCs w:val="0"/>
+          <w:sz w:val="21"/>
+          <w:szCs w:val="21"/>
+          <w:lang w:val="en-US"/>
+        </w:rPr>
+        <w:br/>
       </w:r>
     </w:p>
     <w:p>
@@ -8951,105 +9264,6 @@
           <w:lang w:val="en-US"/>
         </w:rPr>
       </w:pPr>
-      <w:r>
-        <w:rPr>
-          <w:rStyle w:val="Emphasis"/>
-          <w:rFonts w:asciiTheme="majorHAnsi" w:hAnsiTheme="majorHAnsi" w:cstheme="majorHAnsi"/>
-          <w:i w:val="0"/>
-          <w:iCs w:val="0"/>
-          <w:sz w:val="21"/>
-          <w:szCs w:val="21"/>
-          <w:lang w:val="en-US"/>
-        </w:rPr>
-        <w:t xml:space="preserve">When you left, it became quiet...you quit...could have said you were </w:t>
-      </w:r>
-      <w:r>
-        <w:rPr>
-          <w:rStyle w:val="Emphasis"/>
-          <w:rFonts w:asciiTheme="majorHAnsi" w:hAnsiTheme="majorHAnsi" w:cstheme="majorHAnsi"/>
-          <w:i w:val="0"/>
-          <w:iCs w:val="0"/>
-          <w:sz w:val="21"/>
-          <w:szCs w:val="21"/>
-          <w:lang w:val="en-US"/>
-        </w:rPr>
-        <w:t xml:space="preserve">tired, </w:t>
-      </w:r>
-      <w:r>
-        <w:rPr>
-          <w:rStyle w:val="Emphasis"/>
-          <w:rFonts w:asciiTheme="majorHAnsi" w:hAnsiTheme="majorHAnsi" w:cstheme="majorHAnsi"/>
-          <w:i w:val="0"/>
-          <w:iCs w:val="0"/>
-          <w:sz w:val="21"/>
-          <w:szCs w:val="21"/>
-          <w:lang w:val="en-US"/>
-        </w:rPr>
-        <w:t xml:space="preserve">all the world felt lonely </w:t>
-      </w:r>
-    </w:p>
-    <w:p>
-      <w:pPr>
-        <w:pStyle w:val="NormalWeb"/>
-        <w:spacing w:before="0" w:beforeAutospacing="0" w:after="240" w:afterAutospacing="0"/>
-        <w:rPr>
-          <w:rStyle w:val="Emphasis"/>
-          <w:rFonts w:asciiTheme="majorHAnsi" w:hAnsiTheme="majorHAnsi" w:cstheme="majorHAnsi"/>
-          <w:i w:val="0"/>
-          <w:iCs w:val="0"/>
-          <w:sz w:val="21"/>
-          <w:szCs w:val="21"/>
-          <w:lang w:val="en-US"/>
-        </w:rPr>
-      </w:pPr>
-      <w:r>
-        <w:rPr>
-          <w:rStyle w:val="Emphasis"/>
-          <w:rFonts w:asciiTheme="majorHAnsi" w:hAnsiTheme="majorHAnsi" w:cstheme="majorHAnsi"/>
-          <w:i w:val="0"/>
-          <w:iCs w:val="0"/>
-          <w:sz w:val="21"/>
-          <w:szCs w:val="21"/>
-          <w:lang w:val="en-US"/>
-        </w:rPr>
-        <w:t>Then she came through my hero,</w:t>
-      </w:r>
-      <w:r>
-        <w:rPr>
-          <w:rStyle w:val="Emphasis"/>
-          <w:rFonts w:asciiTheme="majorHAnsi" w:hAnsiTheme="majorHAnsi" w:cstheme="majorHAnsi"/>
-          <w:i w:val="0"/>
-          <w:iCs w:val="0"/>
-          <w:sz w:val="21"/>
-          <w:szCs w:val="21"/>
-          <w:lang w:val="en-US"/>
-        </w:rPr>
-        <w:t xml:space="preserve"> </w:t>
-      </w:r>
-      <w:r>
-        <w:rPr>
-          <w:rStyle w:val="Emphasis"/>
-          <w:rFonts w:asciiTheme="majorHAnsi" w:hAnsiTheme="majorHAnsi" w:cstheme="majorHAnsi"/>
-          <w:i w:val="0"/>
-          <w:iCs w:val="0"/>
-          <w:sz w:val="21"/>
-          <w:szCs w:val="21"/>
-          <w:lang w:val="en-US"/>
-        </w:rPr>
-        <w:t>she gets me...just so you know I don't blame you, feels like you paved the way...phew!</w:t>
-      </w:r>
-      <w:r>
-        <w:rPr>
-          <w:rStyle w:val="Emphasis"/>
-          <w:rFonts w:asciiTheme="majorHAnsi" w:hAnsiTheme="majorHAnsi" w:cstheme="majorHAnsi"/>
-          <w:i w:val="0"/>
-          <w:iCs w:val="0"/>
-          <w:sz w:val="21"/>
-          <w:szCs w:val="21"/>
-          <w:lang w:val="en-US"/>
-        </w:rPr>
-        <w:br/>
-      </w:r>
     </w:p>
     <w:p>
       <w:pPr>
@@ -9083,6 +9297,7 @@
           <w:szCs w:val="21"/>
           <w:lang w:val="en-US"/>
         </w:rPr>
+        <w:lastRenderedPageBreak/>
         <w:t>VOICES 3</w:t>
       </w:r>
     </w:p>
@@ -9660,6 +9875,7 @@
           <w:sz w:val="21"/>
           <w:szCs w:val="21"/>
         </w:rPr>
+        <w:lastRenderedPageBreak/>
         <w:t>Alright, you got me!</w:t>
       </w:r>
       <w:r>
@@ -10160,6 +10376,14 @@
           <w:szCs w:val="21"/>
         </w:rPr>
         <w:br/>
+      </w:r>
+      <w:r>
+        <w:rPr>
+          <w:rFonts w:asciiTheme="majorHAnsi" w:hAnsiTheme="majorHAnsi" w:cstheme="majorHAnsi"/>
+          <w:sz w:val="21"/>
+          <w:szCs w:val="21"/>
+        </w:rPr>
+        <w:lastRenderedPageBreak/>
         <w:t>That you belong, that you matter—</w:t>
       </w:r>
       <w:r>
@@ -10634,6 +10858,14 @@
           <w:szCs w:val="21"/>
         </w:rPr>
         <w:br/>
+      </w:r>
+      <w:r>
+        <w:rPr>
+          <w:rFonts w:asciiTheme="majorHAnsi" w:hAnsiTheme="majorHAnsi" w:cstheme="majorHAnsi"/>
+          <w:sz w:val="21"/>
+          <w:szCs w:val="21"/>
+        </w:rPr>
+        <w:lastRenderedPageBreak/>
         <w:t>About the seat you hold now.</w:t>
       </w:r>
       <w:r>
@@ -10870,7 +11102,16 @@
           <w:szCs w:val="21"/>
         </w:rPr>
         <w:br/>
-        <w:t>A pillar to my movement, blue, yet I’ll never walk alone.</w:t>
+        <w:t xml:space="preserve">A pillar to my movement, blue, yet I’ll never walk </w:t>
+      </w:r>
+      <w:r>
+        <w:rPr>
+          <w:rFonts w:asciiTheme="majorHAnsi" w:hAnsiTheme="majorHAnsi" w:cstheme="majorHAnsi"/>
+          <w:sz w:val="21"/>
+          <w:szCs w:val="21"/>
+        </w:rPr>
+        <w:lastRenderedPageBreak/>
+        <w:t>alone.</w:t>
       </w:r>
       <w:r>
         <w:rPr>
@@ -10942,6 +11183,151 @@
           <w:szCs w:val="21"/>
         </w:rPr>
         <w:br/>
+        <w:t>Standing for the minority,</w:t>
+      </w:r>
+      <w:r>
+        <w:rPr>
+          <w:rFonts w:asciiTheme="majorHAnsi" w:hAnsiTheme="majorHAnsi" w:cstheme="majorHAnsi"/>
+          <w:sz w:val="21"/>
+          <w:szCs w:val="21"/>
+        </w:rPr>
+        <w:br/>
+        <w:t>Yet the oceanic tides never did the job.</w:t>
+      </w:r>
+      <w:r>
+        <w:rPr>
+          <w:rFonts w:asciiTheme="majorHAnsi" w:hAnsiTheme="majorHAnsi" w:cstheme="majorHAnsi"/>
+          <w:sz w:val="21"/>
+          <w:szCs w:val="21"/>
+        </w:rPr>
+        <w:br/>
+        <w:t>(Inside joke, only for East.)</w:t>
+      </w:r>
+      <w:r>
+        <w:rPr>
+          <w:rFonts w:asciiTheme="majorHAnsi" w:hAnsiTheme="majorHAnsi" w:cstheme="majorHAnsi"/>
+          <w:sz w:val="21"/>
+          <w:szCs w:val="21"/>
+        </w:rPr>
+        <w:br/>
+        <w:t xml:space="preserve">I hope </w:t>
+      </w:r>
+      <w:proofErr w:type="spellStart"/>
+      <w:r>
+        <w:rPr>
+          <w:rFonts w:asciiTheme="majorHAnsi" w:hAnsiTheme="majorHAnsi" w:cstheme="majorHAnsi"/>
+          <w:sz w:val="21"/>
+          <w:szCs w:val="21"/>
+        </w:rPr>
+        <w:t>Awendo</w:t>
+      </w:r>
+      <w:proofErr w:type="spellEnd"/>
+      <w:r>
+        <w:rPr>
+          <w:rFonts w:asciiTheme="majorHAnsi" w:hAnsiTheme="majorHAnsi" w:cstheme="majorHAnsi"/>
+          <w:sz w:val="21"/>
+          <w:szCs w:val="21"/>
+        </w:rPr>
+        <w:t xml:space="preserve"> is fine—until I see you again, son of the soil.</w:t>
+      </w:r>
+    </w:p>
+    <w:p>
+      <w:pPr>
+        <w:pStyle w:val="NormalWeb"/>
+        <w:spacing w:after="0" w:afterAutospacing="0"/>
+        <w:rPr>
+          <w:rFonts w:asciiTheme="majorHAnsi" w:hAnsiTheme="majorHAnsi" w:cstheme="majorHAnsi"/>
+          <w:sz w:val="21"/>
+          <w:szCs w:val="21"/>
+        </w:rPr>
+      </w:pPr>
+      <w:r>
+        <w:rPr>
+          <w:rFonts w:asciiTheme="majorHAnsi" w:hAnsiTheme="majorHAnsi" w:cstheme="majorHAnsi"/>
+          <w:sz w:val="21"/>
+          <w:szCs w:val="21"/>
+        </w:rPr>
+        <w:t>And now, my lamentation ends—</w:t>
+      </w:r>
+      <w:r>
+        <w:rPr>
+          <w:rFonts w:asciiTheme="majorHAnsi" w:hAnsiTheme="majorHAnsi" w:cstheme="majorHAnsi"/>
+          <w:sz w:val="21"/>
+          <w:szCs w:val="21"/>
+        </w:rPr>
+        <w:br/>
+        <w:t>Reminiscing on times I never thought I’d miss.</w:t>
+      </w:r>
+      <w:r>
+        <w:rPr>
+          <w:rFonts w:asciiTheme="majorHAnsi" w:hAnsiTheme="majorHAnsi" w:cstheme="majorHAnsi"/>
+          <w:sz w:val="21"/>
+          <w:szCs w:val="21"/>
+        </w:rPr>
+        <w:br/>
+        <w:t>Time moved on, so did we, but I love the sight of it all.</w:t>
+      </w:r>
+      <w:r>
+        <w:rPr>
+          <w:rFonts w:asciiTheme="majorHAnsi" w:hAnsiTheme="majorHAnsi" w:cstheme="majorHAnsi"/>
+          <w:sz w:val="21"/>
+          <w:szCs w:val="21"/>
+        </w:rPr>
+        <w:br/>
+        <w:t>But what is a piece without the mention</w:t>
+      </w:r>
+      <w:r>
+        <w:rPr>
+          <w:rFonts w:asciiTheme="majorHAnsi" w:hAnsiTheme="majorHAnsi" w:cstheme="majorHAnsi"/>
+          <w:sz w:val="21"/>
+          <w:szCs w:val="21"/>
+        </w:rPr>
+        <w:br/>
+        <w:t>Of a great chief, even if he never built a palace?</w:t>
+      </w:r>
+      <w:r>
+        <w:rPr>
+          <w:rFonts w:asciiTheme="majorHAnsi" w:hAnsiTheme="majorHAnsi" w:cstheme="majorHAnsi"/>
+          <w:sz w:val="21"/>
+          <w:szCs w:val="21"/>
+        </w:rPr>
+        <w:br/>
+        <w:t>Fear was out of place—Marsh was a great dude,</w:t>
+      </w:r>
+      <w:r>
+        <w:rPr>
+          <w:rFonts w:asciiTheme="majorHAnsi" w:hAnsiTheme="majorHAnsi" w:cstheme="majorHAnsi"/>
+          <w:sz w:val="21"/>
+          <w:szCs w:val="21"/>
+        </w:rPr>
+        <w:br/>
+        <w:t>Deserving a shoutout, even though he wasn’t there to see it all.</w:t>
+      </w:r>
+      <w:r>
+        <w:rPr>
+          <w:rFonts w:asciiTheme="majorHAnsi" w:hAnsiTheme="majorHAnsi" w:cstheme="majorHAnsi"/>
+          <w:sz w:val="21"/>
+          <w:szCs w:val="21"/>
+        </w:rPr>
+        <w:br/>
+        <w:t>Once in a while, people take different routes,</w:t>
+      </w:r>
+      <w:r>
+        <w:rPr>
+          <w:rFonts w:asciiTheme="majorHAnsi" w:hAnsiTheme="majorHAnsi" w:cstheme="majorHAnsi"/>
+          <w:sz w:val="21"/>
+          <w:szCs w:val="21"/>
+        </w:rPr>
+        <w:br/>
+        <w:t>Divergent paths, but I write this to immortalize what we had.</w:t>
+      </w:r>
+      <w:r>
+        <w:rPr>
+          <w:rFonts w:asciiTheme="majorHAnsi" w:hAnsiTheme="majorHAnsi" w:cstheme="majorHAnsi"/>
+          <w:sz w:val="21"/>
+          <w:szCs w:val="21"/>
+        </w:rPr>
+        <w:br/>
       </w:r>
       <w:r>
         <w:rPr>
@@ -10950,151 +11336,6 @@
           <w:szCs w:val="21"/>
         </w:rPr>
         <w:lastRenderedPageBreak/>
-        <w:t>Standing for the minority,</w:t>
-      </w:r>
-      <w:r>
-        <w:rPr>
-          <w:rFonts w:asciiTheme="majorHAnsi" w:hAnsiTheme="majorHAnsi" w:cstheme="majorHAnsi"/>
-          <w:sz w:val="21"/>
-          <w:szCs w:val="21"/>
-        </w:rPr>
-        <w:br/>
-        <w:t>Yet the oceanic tides never did the job.</w:t>
-      </w:r>
-      <w:r>
-        <w:rPr>
-          <w:rFonts w:asciiTheme="majorHAnsi" w:hAnsiTheme="majorHAnsi" w:cstheme="majorHAnsi"/>
-          <w:sz w:val="21"/>
-          <w:szCs w:val="21"/>
-        </w:rPr>
-        <w:br/>
-        <w:t>(Inside joke, only for East.)</w:t>
-      </w:r>
-      <w:r>
-        <w:rPr>
-          <w:rFonts w:asciiTheme="majorHAnsi" w:hAnsiTheme="majorHAnsi" w:cstheme="majorHAnsi"/>
-          <w:sz w:val="21"/>
-          <w:szCs w:val="21"/>
-        </w:rPr>
-        <w:br/>
-        <w:t xml:space="preserve">I hope </w:t>
-      </w:r>
-      <w:proofErr w:type="spellStart"/>
-      <w:r>
-        <w:rPr>
-          <w:rFonts w:asciiTheme="majorHAnsi" w:hAnsiTheme="majorHAnsi" w:cstheme="majorHAnsi"/>
-          <w:sz w:val="21"/>
-          <w:szCs w:val="21"/>
-        </w:rPr>
-        <w:t>Awendo</w:t>
-      </w:r>
-      <w:proofErr w:type="spellEnd"/>
-      <w:r>
-        <w:rPr>
-          <w:rFonts w:asciiTheme="majorHAnsi" w:hAnsiTheme="majorHAnsi" w:cstheme="majorHAnsi"/>
-          <w:sz w:val="21"/>
-          <w:szCs w:val="21"/>
-        </w:rPr>
-        <w:t xml:space="preserve"> is fine—until I see you again, son of the soil.</w:t>
-      </w:r>
-    </w:p>
-    <w:p>
-      <w:pPr>
-        <w:pStyle w:val="NormalWeb"/>
-        <w:spacing w:after="0" w:afterAutospacing="0"/>
-        <w:rPr>
-          <w:rFonts w:asciiTheme="majorHAnsi" w:hAnsiTheme="majorHAnsi" w:cstheme="majorHAnsi"/>
-          <w:sz w:val="21"/>
-          <w:szCs w:val="21"/>
-        </w:rPr>
-      </w:pPr>
-      <w:r>
-        <w:rPr>
-          <w:rFonts w:asciiTheme="majorHAnsi" w:hAnsiTheme="majorHAnsi" w:cstheme="majorHAnsi"/>
-          <w:sz w:val="21"/>
-          <w:szCs w:val="21"/>
-        </w:rPr>
-        <w:t>And now, my lamentation ends—</w:t>
-      </w:r>
-      <w:r>
-        <w:rPr>
-          <w:rFonts w:asciiTheme="majorHAnsi" w:hAnsiTheme="majorHAnsi" w:cstheme="majorHAnsi"/>
-          <w:sz w:val="21"/>
-          <w:szCs w:val="21"/>
-        </w:rPr>
-        <w:br/>
-        <w:t>Reminiscing on times I never thought I’d miss.</w:t>
-      </w:r>
-      <w:r>
-        <w:rPr>
-          <w:rFonts w:asciiTheme="majorHAnsi" w:hAnsiTheme="majorHAnsi" w:cstheme="majorHAnsi"/>
-          <w:sz w:val="21"/>
-          <w:szCs w:val="21"/>
-        </w:rPr>
-        <w:br/>
-        <w:t>Time moved on, so did we, but I love the sight of it all.</w:t>
-      </w:r>
-      <w:r>
-        <w:rPr>
-          <w:rFonts w:asciiTheme="majorHAnsi" w:hAnsiTheme="majorHAnsi" w:cstheme="majorHAnsi"/>
-          <w:sz w:val="21"/>
-          <w:szCs w:val="21"/>
-        </w:rPr>
-        <w:br/>
-        <w:t>But what is a piece without the mention</w:t>
-      </w:r>
-      <w:r>
-        <w:rPr>
-          <w:rFonts w:asciiTheme="majorHAnsi" w:hAnsiTheme="majorHAnsi" w:cstheme="majorHAnsi"/>
-          <w:sz w:val="21"/>
-          <w:szCs w:val="21"/>
-        </w:rPr>
-        <w:br/>
-        <w:t>Of a great chief, even if he never built a palace?</w:t>
-      </w:r>
-      <w:r>
-        <w:rPr>
-          <w:rFonts w:asciiTheme="majorHAnsi" w:hAnsiTheme="majorHAnsi" w:cstheme="majorHAnsi"/>
-          <w:sz w:val="21"/>
-          <w:szCs w:val="21"/>
-        </w:rPr>
-        <w:br/>
-        <w:t>Fear was out of place—Marsh was a great dude,</w:t>
-      </w:r>
-      <w:r>
-        <w:rPr>
-          <w:rFonts w:asciiTheme="majorHAnsi" w:hAnsiTheme="majorHAnsi" w:cstheme="majorHAnsi"/>
-          <w:sz w:val="21"/>
-          <w:szCs w:val="21"/>
-        </w:rPr>
-        <w:br/>
-        <w:t>Deserving a shoutout, even though he wasn’t there to see it all.</w:t>
-      </w:r>
-      <w:r>
-        <w:rPr>
-          <w:rFonts w:asciiTheme="majorHAnsi" w:hAnsiTheme="majorHAnsi" w:cstheme="majorHAnsi"/>
-          <w:sz w:val="21"/>
-          <w:szCs w:val="21"/>
-        </w:rPr>
-        <w:br/>
-        <w:t>Once in a while, people take different routes,</w:t>
-      </w:r>
-      <w:r>
-        <w:rPr>
-          <w:rFonts w:asciiTheme="majorHAnsi" w:hAnsiTheme="majorHAnsi" w:cstheme="majorHAnsi"/>
-          <w:sz w:val="21"/>
-          <w:szCs w:val="21"/>
-        </w:rPr>
-        <w:br/>
-        <w:t>Divergent paths, but I write this to immortalize what we had.</w:t>
-      </w:r>
-      <w:r>
-        <w:rPr>
-          <w:rFonts w:asciiTheme="majorHAnsi" w:hAnsiTheme="majorHAnsi" w:cstheme="majorHAnsi"/>
-          <w:sz w:val="21"/>
-          <w:szCs w:val="21"/>
-        </w:rPr>
-        <w:br/>
         <w:t>Brotherhood, forged in plain sight,</w:t>
       </w:r>
       <w:r>
@@ -11124,17 +11365,6 @@
         <w:br/>
         <w:t>Once a V, always a V!</w:t>
       </w:r>
-    </w:p>
-    <w:p>
-      <w:pPr>
-        <w:pStyle w:val="NormalWeb"/>
-        <w:spacing w:after="0" w:afterAutospacing="0"/>
-        <w:rPr>
-          <w:rFonts w:asciiTheme="majorHAnsi" w:hAnsiTheme="majorHAnsi" w:cstheme="majorHAnsi"/>
-          <w:sz w:val="21"/>
-          <w:szCs w:val="21"/>
-        </w:rPr>
-      </w:pPr>
     </w:p>
     <w:p>
       <w:pPr>
@@ -11343,6 +11573,7 @@
           <w:sz w:val="21"/>
           <w:szCs w:val="21"/>
         </w:rPr>
+        <w:lastRenderedPageBreak/>
         <w:t>I want a coat—</w:t>
       </w:r>
       <w:r>
@@ -11433,14 +11664,6 @@
           <w:szCs w:val="21"/>
         </w:rPr>
         <w:br/>
-      </w:r>
-      <w:r>
-        <w:rPr>
-          <w:rFonts w:asciiTheme="majorHAnsi" w:hAnsiTheme="majorHAnsi" w:cstheme="majorHAnsi"/>
-          <w:sz w:val="21"/>
-          <w:szCs w:val="21"/>
-        </w:rPr>
-        <w:lastRenderedPageBreak/>
         <w:t xml:space="preserve">Even then, I want to do it with a </w:t>
       </w:r>
       <w:proofErr w:type="spellStart"/>
@@ -11558,13 +11781,19 @@
         <w:spacing w:after="0" w:afterAutospacing="0"/>
         <w:rPr>
           <w:rFonts w:asciiTheme="majorHAnsi" w:hAnsiTheme="majorHAnsi" w:cstheme="majorHAnsi"/>
-          <w:sz w:val="21"/>
-          <w:szCs w:val="21"/>
-        </w:rPr>
-      </w:pPr>
-      <w:r>
-        <w:rPr>
-          <w:rFonts w:asciiTheme="majorHAnsi" w:hAnsiTheme="majorHAnsi" w:cstheme="majorHAnsi"/>
+          <w:i/>
+          <w:iCs/>
+          <w:color w:val="385623" w:themeColor="accent6" w:themeShade="80"/>
+          <w:sz w:val="21"/>
+          <w:szCs w:val="21"/>
+        </w:rPr>
+      </w:pPr>
+      <w:r>
+        <w:rPr>
+          <w:rFonts w:asciiTheme="majorHAnsi" w:hAnsiTheme="majorHAnsi" w:cstheme="majorHAnsi"/>
+          <w:i/>
+          <w:iCs/>
+          <w:color w:val="385623" w:themeColor="accent6" w:themeShade="80"/>
           <w:sz w:val="21"/>
           <w:szCs w:val="21"/>
         </w:rPr>
@@ -11573,6 +11802,9 @@
       <w:r>
         <w:rPr>
           <w:rFonts w:asciiTheme="majorHAnsi" w:hAnsiTheme="majorHAnsi" w:cstheme="majorHAnsi"/>
+          <w:i/>
+          <w:iCs/>
+          <w:color w:val="385623" w:themeColor="accent6" w:themeShade="80"/>
           <w:sz w:val="21"/>
           <w:szCs w:val="21"/>
         </w:rPr>
@@ -11582,6 +11814,9 @@
       <w:r>
         <w:rPr>
           <w:rFonts w:asciiTheme="majorHAnsi" w:hAnsiTheme="majorHAnsi" w:cstheme="majorHAnsi"/>
+          <w:i/>
+          <w:iCs/>
+          <w:color w:val="385623" w:themeColor="accent6" w:themeShade="80"/>
           <w:sz w:val="21"/>
           <w:szCs w:val="21"/>
         </w:rPr>
@@ -11595,13 +11830,19 @@
         <w:spacing w:after="0" w:afterAutospacing="0"/>
         <w:rPr>
           <w:rFonts w:asciiTheme="majorHAnsi" w:hAnsiTheme="majorHAnsi" w:cstheme="majorHAnsi"/>
-          <w:sz w:val="21"/>
-          <w:szCs w:val="21"/>
-        </w:rPr>
-      </w:pPr>
-      <w:r>
-        <w:rPr>
-          <w:rFonts w:asciiTheme="majorHAnsi" w:hAnsiTheme="majorHAnsi" w:cstheme="majorHAnsi"/>
+          <w:i/>
+          <w:iCs/>
+          <w:color w:val="385623" w:themeColor="accent6" w:themeShade="80"/>
+          <w:sz w:val="21"/>
+          <w:szCs w:val="21"/>
+        </w:rPr>
+      </w:pPr>
+      <w:r>
+        <w:rPr>
+          <w:rFonts w:asciiTheme="majorHAnsi" w:hAnsiTheme="majorHAnsi" w:cstheme="majorHAnsi"/>
+          <w:i/>
+          <w:iCs/>
+          <w:color w:val="385623" w:themeColor="accent6" w:themeShade="80"/>
           <w:sz w:val="21"/>
           <w:szCs w:val="21"/>
         </w:rPr>
@@ -11614,13 +11855,19 @@
         <w:spacing w:after="0" w:afterAutospacing="0"/>
         <w:rPr>
           <w:rFonts w:asciiTheme="majorHAnsi" w:hAnsiTheme="majorHAnsi" w:cstheme="majorHAnsi"/>
-          <w:sz w:val="21"/>
-          <w:szCs w:val="21"/>
-        </w:rPr>
-      </w:pPr>
-      <w:r>
-        <w:rPr>
-          <w:rFonts w:asciiTheme="majorHAnsi" w:hAnsiTheme="majorHAnsi" w:cstheme="majorHAnsi"/>
+          <w:i/>
+          <w:iCs/>
+          <w:color w:val="385623" w:themeColor="accent6" w:themeShade="80"/>
+          <w:sz w:val="21"/>
+          <w:szCs w:val="21"/>
+        </w:rPr>
+      </w:pPr>
+      <w:r>
+        <w:rPr>
+          <w:rFonts w:asciiTheme="majorHAnsi" w:hAnsiTheme="majorHAnsi" w:cstheme="majorHAnsi"/>
+          <w:i/>
+          <w:iCs/>
+          <w:color w:val="385623" w:themeColor="accent6" w:themeShade="80"/>
           <w:sz w:val="21"/>
           <w:szCs w:val="21"/>
         </w:rPr>
@@ -11629,6 +11876,9 @@
       <w:r>
         <w:rPr>
           <w:rFonts w:asciiTheme="majorHAnsi" w:hAnsiTheme="majorHAnsi" w:cstheme="majorHAnsi"/>
+          <w:i/>
+          <w:iCs/>
+          <w:color w:val="385623" w:themeColor="accent6" w:themeShade="80"/>
           <w:sz w:val="21"/>
           <w:szCs w:val="21"/>
         </w:rPr>
@@ -11638,6 +11888,9 @@
       <w:r>
         <w:rPr>
           <w:rFonts w:asciiTheme="majorHAnsi" w:hAnsiTheme="majorHAnsi" w:cstheme="majorHAnsi"/>
+          <w:i/>
+          <w:iCs/>
+          <w:color w:val="385623" w:themeColor="accent6" w:themeShade="80"/>
           <w:sz w:val="21"/>
           <w:szCs w:val="21"/>
           <w:lang w:val="en-US"/>
@@ -11647,15 +11900,32 @@
       <w:r>
         <w:rPr>
           <w:rFonts w:asciiTheme="majorHAnsi" w:hAnsiTheme="majorHAnsi" w:cstheme="majorHAnsi"/>
-          <w:sz w:val="21"/>
-          <w:szCs w:val="21"/>
-        </w:rPr>
-        <w:br/>
+          <w:i/>
+          <w:iCs/>
+          <w:color w:val="385623" w:themeColor="accent6" w:themeShade="80"/>
+          <w:sz w:val="21"/>
+          <w:szCs w:val="21"/>
+        </w:rPr>
+        <w:br/>
+      </w:r>
+      <w:r>
+        <w:rPr>
+          <w:rFonts w:asciiTheme="majorHAnsi" w:hAnsiTheme="majorHAnsi" w:cstheme="majorHAnsi"/>
+          <w:i/>
+          <w:iCs/>
+          <w:color w:val="385623" w:themeColor="accent6" w:themeShade="80"/>
+          <w:sz w:val="21"/>
+          <w:szCs w:val="21"/>
+        </w:rPr>
+        <w:lastRenderedPageBreak/>
         <w:t>with gratitude,</w:t>
       </w:r>
       <w:r>
         <w:rPr>
           <w:rFonts w:asciiTheme="majorHAnsi" w:hAnsiTheme="majorHAnsi" w:cstheme="majorHAnsi"/>
+          <w:i/>
+          <w:iCs/>
+          <w:color w:val="385623" w:themeColor="accent6" w:themeShade="80"/>
           <w:sz w:val="21"/>
           <w:szCs w:val="21"/>
         </w:rPr>
@@ -11665,23 +11935,15 @@
       <w:r>
         <w:rPr>
           <w:rFonts w:asciiTheme="majorHAnsi" w:hAnsiTheme="majorHAnsi" w:cstheme="majorHAnsi"/>
+          <w:i/>
+          <w:iCs/>
+          <w:color w:val="385623" w:themeColor="accent6" w:themeShade="80"/>
           <w:sz w:val="21"/>
           <w:szCs w:val="21"/>
         </w:rPr>
         <w:br/>
         <w:t>and with love still in my hands.</w:t>
       </w:r>
-    </w:p>
-    <w:p>
-      <w:pPr>
-        <w:pStyle w:val="NormalWeb"/>
-        <w:spacing w:after="0" w:afterAutospacing="0"/>
-        <w:rPr>
-          <w:rFonts w:asciiTheme="majorHAnsi" w:hAnsiTheme="majorHAnsi" w:cstheme="majorHAnsi"/>
-          <w:sz w:val="21"/>
-          <w:szCs w:val="21"/>
-        </w:rPr>
-      </w:pPr>
     </w:p>
     <w:p>
       <w:pPr>
@@ -11938,6 +12200,7 @@
           <w:szCs w:val="21"/>
           <w:lang w:eastAsia="en-KE"/>
         </w:rPr>
+        <w:lastRenderedPageBreak/>
         <w:t>Is it fair to pen the whole story in one line?</w:t>
       </w:r>
       <w:r>
@@ -11978,7 +12241,6 @@
           <w:szCs w:val="21"/>
           <w:lang w:eastAsia="en-KE"/>
         </w:rPr>
-        <w:lastRenderedPageBreak/>
         <w:t>I might as well.</w:t>
       </w:r>
       <w:r>
@@ -12209,6 +12471,7 @@
           <w:szCs w:val="21"/>
           <w:lang w:eastAsia="en-KE"/>
         </w:rPr>
+        <w:lastRenderedPageBreak/>
         <w:t>Maybe I’ll get a doll to hold</w:t>
       </w:r>
       <w:r>
@@ -12844,6 +13107,7 @@
           <w:szCs w:val="21"/>
           <w:lang w:val="en-US" w:eastAsia="en-KE"/>
         </w:rPr>
+        <w:lastRenderedPageBreak/>
         <w:t>The world demands that you stand on your own,</w:t>
       </w:r>
     </w:p>
@@ -13366,6 +13630,7 @@
           <w:szCs w:val="21"/>
           <w:lang w:val="en-US" w:eastAsia="en-KE"/>
         </w:rPr>
+        <w:lastRenderedPageBreak/>
         <w:t>Not every soft soul adapts this fast.</w:t>
       </w:r>
     </w:p>
@@ -13861,6 +14126,7 @@
           <w:szCs w:val="21"/>
           <w:lang w:val="en-US" w:eastAsia="en-KE"/>
         </w:rPr>
+        <w:lastRenderedPageBreak/>
         <w:t>There was a time she knew love,</w:t>
       </w:r>
     </w:p>
@@ -14234,118 +14500,118 @@
           <w:szCs w:val="21"/>
           <w:lang w:val="en-US" w:eastAsia="en-KE"/>
         </w:rPr>
+        <w:t>Now, in his world, she doesn’t exist.</w:t>
+      </w:r>
+    </w:p>
+    <w:p>
+      <w:pPr>
+        <w:spacing w:after="0" w:line="240" w:lineRule="auto"/>
+        <w:rPr>
+          <w:rFonts w:asciiTheme="majorHAnsi" w:eastAsia="Times New Roman" w:hAnsiTheme="majorHAnsi" w:cstheme="majorHAnsi"/>
+          <w:sz w:val="21"/>
+          <w:szCs w:val="21"/>
+          <w:lang w:val="en-US" w:eastAsia="en-KE"/>
+        </w:rPr>
+      </w:pPr>
+      <w:r>
+        <w:rPr>
+          <w:rFonts w:asciiTheme="majorHAnsi" w:eastAsia="Times New Roman" w:hAnsiTheme="majorHAnsi" w:cstheme="majorHAnsi"/>
+          <w:sz w:val="21"/>
+          <w:szCs w:val="21"/>
+          <w:lang w:val="en-US" w:eastAsia="en-KE"/>
+        </w:rPr>
+        <w:t>Yet in hers, she carries a piece of him.</w:t>
+      </w:r>
+    </w:p>
+    <w:p>
+      <w:pPr>
+        <w:spacing w:after="0" w:line="240" w:lineRule="auto"/>
+        <w:rPr>
+          <w:rFonts w:asciiTheme="majorHAnsi" w:eastAsia="Times New Roman" w:hAnsiTheme="majorHAnsi" w:cstheme="majorHAnsi"/>
+          <w:sz w:val="21"/>
+          <w:szCs w:val="21"/>
+          <w:lang w:val="en-US" w:eastAsia="en-KE"/>
+        </w:rPr>
+      </w:pPr>
+    </w:p>
+    <w:p>
+      <w:pPr>
+        <w:spacing w:after="0" w:line="240" w:lineRule="auto"/>
+        <w:rPr>
+          <w:rFonts w:asciiTheme="majorHAnsi" w:eastAsia="Times New Roman" w:hAnsiTheme="majorHAnsi" w:cstheme="majorHAnsi"/>
+          <w:sz w:val="21"/>
+          <w:szCs w:val="21"/>
+          <w:lang w:val="en-US" w:eastAsia="en-KE"/>
+        </w:rPr>
+      </w:pPr>
+      <w:r>
+        <w:rPr>
+          <w:rFonts w:asciiTheme="majorHAnsi" w:eastAsia="Times New Roman" w:hAnsiTheme="majorHAnsi" w:cstheme="majorHAnsi"/>
+          <w:sz w:val="21"/>
+          <w:szCs w:val="21"/>
+          <w:lang w:val="en-US" w:eastAsia="en-KE"/>
+        </w:rPr>
+        <w:t>She turns to the child—still crying.</w:t>
+      </w:r>
+    </w:p>
+    <w:p>
+      <w:pPr>
+        <w:spacing w:after="0" w:line="240" w:lineRule="auto"/>
+        <w:rPr>
+          <w:rFonts w:asciiTheme="majorHAnsi" w:eastAsia="Times New Roman" w:hAnsiTheme="majorHAnsi" w:cstheme="majorHAnsi"/>
+          <w:sz w:val="21"/>
+          <w:szCs w:val="21"/>
+          <w:lang w:val="en-US" w:eastAsia="en-KE"/>
+        </w:rPr>
+      </w:pPr>
+      <w:r>
+        <w:rPr>
+          <w:rFonts w:asciiTheme="majorHAnsi" w:eastAsia="Times New Roman" w:hAnsiTheme="majorHAnsi" w:cstheme="majorHAnsi"/>
+          <w:sz w:val="21"/>
+          <w:szCs w:val="21"/>
+          <w:lang w:val="en-US" w:eastAsia="en-KE"/>
+        </w:rPr>
+        <w:t>He can talk but, like his father,</w:t>
+      </w:r>
+    </w:p>
+    <w:p>
+      <w:pPr>
+        <w:spacing w:after="0" w:line="240" w:lineRule="auto"/>
+        <w:rPr>
+          <w:rFonts w:asciiTheme="majorHAnsi" w:eastAsia="Times New Roman" w:hAnsiTheme="majorHAnsi" w:cstheme="majorHAnsi"/>
+          <w:sz w:val="21"/>
+          <w:szCs w:val="21"/>
+          <w:lang w:val="en-US" w:eastAsia="en-KE"/>
+        </w:rPr>
+      </w:pPr>
+      <w:r>
+        <w:rPr>
+          <w:rFonts w:asciiTheme="majorHAnsi" w:eastAsia="Times New Roman" w:hAnsiTheme="majorHAnsi" w:cstheme="majorHAnsi"/>
+          <w:sz w:val="21"/>
+          <w:szCs w:val="21"/>
+          <w:lang w:val="en-US" w:eastAsia="en-KE"/>
+        </w:rPr>
+        <w:t>is slow to walk.</w:t>
+      </w:r>
+    </w:p>
+    <w:p>
+      <w:pPr>
+        <w:spacing w:after="0" w:line="240" w:lineRule="auto"/>
+        <w:rPr>
+          <w:rFonts w:asciiTheme="majorHAnsi" w:eastAsia="Times New Roman" w:hAnsiTheme="majorHAnsi" w:cstheme="majorHAnsi"/>
+          <w:sz w:val="21"/>
+          <w:szCs w:val="21"/>
+          <w:lang w:val="en-US" w:eastAsia="en-KE"/>
+        </w:rPr>
+      </w:pPr>
+      <w:r>
+        <w:rPr>
+          <w:rFonts w:asciiTheme="majorHAnsi" w:eastAsia="Times New Roman" w:hAnsiTheme="majorHAnsi" w:cstheme="majorHAnsi"/>
+          <w:sz w:val="21"/>
+          <w:szCs w:val="21"/>
+          <w:lang w:val="en-US" w:eastAsia="en-KE"/>
+        </w:rPr>
         <w:lastRenderedPageBreak/>
-        <w:t>Now, in his world, she doesn’t exist.</w:t>
-      </w:r>
-    </w:p>
-    <w:p>
-      <w:pPr>
-        <w:spacing w:after="0" w:line="240" w:lineRule="auto"/>
-        <w:rPr>
-          <w:rFonts w:asciiTheme="majorHAnsi" w:eastAsia="Times New Roman" w:hAnsiTheme="majorHAnsi" w:cstheme="majorHAnsi"/>
-          <w:sz w:val="21"/>
-          <w:szCs w:val="21"/>
-          <w:lang w:val="en-US" w:eastAsia="en-KE"/>
-        </w:rPr>
-      </w:pPr>
-      <w:r>
-        <w:rPr>
-          <w:rFonts w:asciiTheme="majorHAnsi" w:eastAsia="Times New Roman" w:hAnsiTheme="majorHAnsi" w:cstheme="majorHAnsi"/>
-          <w:sz w:val="21"/>
-          <w:szCs w:val="21"/>
-          <w:lang w:val="en-US" w:eastAsia="en-KE"/>
-        </w:rPr>
-        <w:t>Yet in hers, she carries a piece of him.</w:t>
-      </w:r>
-    </w:p>
-    <w:p>
-      <w:pPr>
-        <w:spacing w:after="0" w:line="240" w:lineRule="auto"/>
-        <w:rPr>
-          <w:rFonts w:asciiTheme="majorHAnsi" w:eastAsia="Times New Roman" w:hAnsiTheme="majorHAnsi" w:cstheme="majorHAnsi"/>
-          <w:sz w:val="21"/>
-          <w:szCs w:val="21"/>
-          <w:lang w:val="en-US" w:eastAsia="en-KE"/>
-        </w:rPr>
-      </w:pPr>
-    </w:p>
-    <w:p>
-      <w:pPr>
-        <w:spacing w:after="0" w:line="240" w:lineRule="auto"/>
-        <w:rPr>
-          <w:rFonts w:asciiTheme="majorHAnsi" w:eastAsia="Times New Roman" w:hAnsiTheme="majorHAnsi" w:cstheme="majorHAnsi"/>
-          <w:sz w:val="21"/>
-          <w:szCs w:val="21"/>
-          <w:lang w:val="en-US" w:eastAsia="en-KE"/>
-        </w:rPr>
-      </w:pPr>
-      <w:r>
-        <w:rPr>
-          <w:rFonts w:asciiTheme="majorHAnsi" w:eastAsia="Times New Roman" w:hAnsiTheme="majorHAnsi" w:cstheme="majorHAnsi"/>
-          <w:sz w:val="21"/>
-          <w:szCs w:val="21"/>
-          <w:lang w:val="en-US" w:eastAsia="en-KE"/>
-        </w:rPr>
-        <w:t>She turns to the child—still crying.</w:t>
-      </w:r>
-    </w:p>
-    <w:p>
-      <w:pPr>
-        <w:spacing w:after="0" w:line="240" w:lineRule="auto"/>
-        <w:rPr>
-          <w:rFonts w:asciiTheme="majorHAnsi" w:eastAsia="Times New Roman" w:hAnsiTheme="majorHAnsi" w:cstheme="majorHAnsi"/>
-          <w:sz w:val="21"/>
-          <w:szCs w:val="21"/>
-          <w:lang w:val="en-US" w:eastAsia="en-KE"/>
-        </w:rPr>
-      </w:pPr>
-      <w:r>
-        <w:rPr>
-          <w:rFonts w:asciiTheme="majorHAnsi" w:eastAsia="Times New Roman" w:hAnsiTheme="majorHAnsi" w:cstheme="majorHAnsi"/>
-          <w:sz w:val="21"/>
-          <w:szCs w:val="21"/>
-          <w:lang w:val="en-US" w:eastAsia="en-KE"/>
-        </w:rPr>
-        <w:t>He can talk but, like his father,</w:t>
-      </w:r>
-    </w:p>
-    <w:p>
-      <w:pPr>
-        <w:spacing w:after="0" w:line="240" w:lineRule="auto"/>
-        <w:rPr>
-          <w:rFonts w:asciiTheme="majorHAnsi" w:eastAsia="Times New Roman" w:hAnsiTheme="majorHAnsi" w:cstheme="majorHAnsi"/>
-          <w:sz w:val="21"/>
-          <w:szCs w:val="21"/>
-          <w:lang w:val="en-US" w:eastAsia="en-KE"/>
-        </w:rPr>
-      </w:pPr>
-      <w:r>
-        <w:rPr>
-          <w:rFonts w:asciiTheme="majorHAnsi" w:eastAsia="Times New Roman" w:hAnsiTheme="majorHAnsi" w:cstheme="majorHAnsi"/>
-          <w:sz w:val="21"/>
-          <w:szCs w:val="21"/>
-          <w:lang w:val="en-US" w:eastAsia="en-KE"/>
-        </w:rPr>
-        <w:t>is slow to walk.</w:t>
-      </w:r>
-    </w:p>
-    <w:p>
-      <w:pPr>
-        <w:spacing w:after="0" w:line="240" w:lineRule="auto"/>
-        <w:rPr>
-          <w:rFonts w:asciiTheme="majorHAnsi" w:eastAsia="Times New Roman" w:hAnsiTheme="majorHAnsi" w:cstheme="majorHAnsi"/>
-          <w:sz w:val="21"/>
-          <w:szCs w:val="21"/>
-          <w:lang w:val="en-US" w:eastAsia="en-KE"/>
-        </w:rPr>
-      </w:pPr>
-      <w:r>
-        <w:rPr>
-          <w:rFonts w:asciiTheme="majorHAnsi" w:eastAsia="Times New Roman" w:hAnsiTheme="majorHAnsi" w:cstheme="majorHAnsi"/>
-          <w:sz w:val="21"/>
-          <w:szCs w:val="21"/>
-          <w:lang w:val="en-US" w:eastAsia="en-KE"/>
-        </w:rPr>
         <w:t>She hugs him tight,</w:t>
       </w:r>
     </w:p>
@@ -14812,6 +15078,7 @@
           <w:szCs w:val="21"/>
           <w:lang w:val="en-US" w:eastAsia="en-KE"/>
         </w:rPr>
+        <w:lastRenderedPageBreak/>
         <w:t>a day when guilt wouldn’t choke me,</w:t>
       </w:r>
     </w:p>
@@ -15105,7 +15372,6 @@
           <w:szCs w:val="21"/>
           <w:lang w:val="en-US" w:eastAsia="en-KE"/>
         </w:rPr>
-        <w:lastRenderedPageBreak/>
         <w:t>I swore to return,</w:t>
       </w:r>
     </w:p>
@@ -15693,6 +15959,14 @@
           <w:szCs w:val="21"/>
         </w:rPr>
         <w:br/>
+      </w:r>
+      <w:r>
+        <w:rPr>
+          <w:rFonts w:asciiTheme="majorHAnsi" w:hAnsiTheme="majorHAnsi" w:cstheme="majorHAnsi"/>
+          <w:sz w:val="21"/>
+          <w:szCs w:val="21"/>
+        </w:rPr>
+        <w:lastRenderedPageBreak/>
         <w:t>A car horn blares—I barely flinch,</w:t>
       </w:r>
       <w:r>
@@ -15837,8 +16111,172 @@
           <w:sz w:val="21"/>
           <w:szCs w:val="21"/>
         </w:rPr>
+        <w:t>PAIN</w:t>
+      </w:r>
+    </w:p>
+    <w:p>
+      <w:pPr>
+        <w:pStyle w:val="NormalWeb"/>
+        <w:spacing w:after="0" w:afterAutospacing="0"/>
+        <w:rPr>
+          <w:rFonts w:asciiTheme="majorHAnsi" w:hAnsiTheme="majorHAnsi" w:cstheme="majorHAnsi"/>
+          <w:sz w:val="21"/>
+          <w:szCs w:val="21"/>
+        </w:rPr>
+      </w:pPr>
+      <w:r>
+        <w:rPr>
+          <w:rFonts w:asciiTheme="majorHAnsi" w:hAnsiTheme="majorHAnsi" w:cstheme="majorHAnsi"/>
+          <w:sz w:val="21"/>
+          <w:szCs w:val="21"/>
+        </w:rPr>
+        <w:t>I don’t call back home that much.</w:t>
+      </w:r>
+      <w:r>
+        <w:rPr>
+          <w:rFonts w:asciiTheme="majorHAnsi" w:hAnsiTheme="majorHAnsi" w:cstheme="majorHAnsi"/>
+          <w:sz w:val="21"/>
+          <w:szCs w:val="21"/>
+        </w:rPr>
+        <w:br/>
+        <w:t xml:space="preserve">Mum rings and asks, </w:t>
+      </w:r>
+      <w:r>
+        <w:rPr>
+          <w:rStyle w:val="Emphasis"/>
+          <w:rFonts w:asciiTheme="majorHAnsi" w:hAnsiTheme="majorHAnsi" w:cstheme="majorHAnsi"/>
+          <w:sz w:val="21"/>
+          <w:szCs w:val="21"/>
+        </w:rPr>
+        <w:t>“What’s up?”</w:t>
+      </w:r>
+      <w:r>
+        <w:rPr>
+          <w:rFonts w:asciiTheme="majorHAnsi" w:hAnsiTheme="majorHAnsi" w:cstheme="majorHAnsi"/>
+          <w:sz w:val="21"/>
+          <w:szCs w:val="21"/>
+        </w:rPr>
+        <w:br/>
+        <w:t>She knows it might go south,</w:t>
+      </w:r>
+      <w:r>
+        <w:rPr>
+          <w:rFonts w:asciiTheme="majorHAnsi" w:hAnsiTheme="majorHAnsi" w:cstheme="majorHAnsi"/>
+          <w:sz w:val="21"/>
+          <w:szCs w:val="21"/>
+        </w:rPr>
+        <w:br/>
+        <w:t>knows it can be cruel out here.</w:t>
+      </w:r>
+    </w:p>
+    <w:p>
+      <w:pPr>
+        <w:pStyle w:val="NormalWeb"/>
+        <w:spacing w:after="0" w:afterAutospacing="0"/>
+        <w:rPr>
+          <w:rFonts w:asciiTheme="majorHAnsi" w:hAnsiTheme="majorHAnsi" w:cstheme="majorHAnsi"/>
+          <w:sz w:val="21"/>
+          <w:szCs w:val="21"/>
+        </w:rPr>
+      </w:pPr>
+      <w:r>
+        <w:rPr>
+          <w:rFonts w:asciiTheme="majorHAnsi" w:hAnsiTheme="majorHAnsi" w:cstheme="majorHAnsi"/>
+          <w:sz w:val="21"/>
+          <w:szCs w:val="21"/>
+        </w:rPr>
+        <w:t>But her baby boy will never cry for help—</w:t>
+      </w:r>
+      <w:r>
+        <w:rPr>
+          <w:rFonts w:asciiTheme="majorHAnsi" w:hAnsiTheme="majorHAnsi" w:cstheme="majorHAnsi"/>
+          <w:sz w:val="21"/>
+          <w:szCs w:val="21"/>
+        </w:rPr>
+        <w:br/>
+        <w:t>walks alone</w:t>
+      </w:r>
+      <w:r>
+        <w:rPr>
+          <w:rFonts w:asciiTheme="majorHAnsi" w:hAnsiTheme="majorHAnsi" w:cstheme="majorHAnsi"/>
+          <w:sz w:val="21"/>
+          <w:szCs w:val="21"/>
+          <w:lang w:val="en-US"/>
+        </w:rPr>
+        <w:t>, back from hell</w:t>
+      </w:r>
+      <w:r>
+        <w:rPr>
+          <w:rFonts w:asciiTheme="majorHAnsi" w:hAnsiTheme="majorHAnsi" w:cstheme="majorHAnsi"/>
+          <w:sz w:val="21"/>
+          <w:szCs w:val="21"/>
+        </w:rPr>
+        <w:t xml:space="preserve"> </w:t>
+      </w:r>
+      <w:r>
+        <w:rPr>
+          <w:rFonts w:asciiTheme="majorHAnsi" w:hAnsiTheme="majorHAnsi" w:cstheme="majorHAnsi"/>
+          <w:sz w:val="21"/>
+          <w:szCs w:val="21"/>
+        </w:rPr>
+        <w:br/>
+        <w:t>That’s the life of a man, isn’t it?</w:t>
+      </w:r>
+    </w:p>
+    <w:p>
+      <w:pPr>
+        <w:pStyle w:val="NormalWeb"/>
+        <w:spacing w:after="0" w:afterAutospacing="0"/>
+        <w:rPr>
+          <w:rFonts w:asciiTheme="majorHAnsi" w:hAnsiTheme="majorHAnsi" w:cstheme="majorHAnsi"/>
+          <w:sz w:val="21"/>
+          <w:szCs w:val="21"/>
+        </w:rPr>
+      </w:pPr>
+      <w:r>
+        <w:rPr>
+          <w:rFonts w:asciiTheme="majorHAnsi" w:hAnsiTheme="majorHAnsi" w:cstheme="majorHAnsi"/>
+          <w:sz w:val="21"/>
+          <w:szCs w:val="21"/>
+        </w:rPr>
         <w:lastRenderedPageBreak/>
-        <w:t>PAIN</w:t>
+        <w:t>That’s the love of a mother—</w:t>
+      </w:r>
+      <w:r>
+        <w:rPr>
+          <w:rFonts w:asciiTheme="majorHAnsi" w:hAnsiTheme="majorHAnsi" w:cstheme="majorHAnsi"/>
+          <w:sz w:val="21"/>
+          <w:szCs w:val="21"/>
+        </w:rPr>
+        <w:br/>
+        <w:t>with barely enough on her plate,</w:t>
+      </w:r>
+      <w:r>
+        <w:rPr>
+          <w:rFonts w:asciiTheme="majorHAnsi" w:hAnsiTheme="majorHAnsi" w:cstheme="majorHAnsi"/>
+          <w:sz w:val="21"/>
+          <w:szCs w:val="21"/>
+        </w:rPr>
+        <w:br/>
+        <w:t>still asking if I’m fed.</w:t>
+      </w:r>
+      <w:r>
+        <w:rPr>
+          <w:rFonts w:asciiTheme="majorHAnsi" w:hAnsiTheme="majorHAnsi" w:cstheme="majorHAnsi"/>
+          <w:sz w:val="21"/>
+          <w:szCs w:val="21"/>
+        </w:rPr>
+        <w:br/>
+        <w:t>Working the land,</w:t>
+      </w:r>
+      <w:r>
+        <w:rPr>
+          <w:rFonts w:asciiTheme="majorHAnsi" w:hAnsiTheme="majorHAnsi" w:cstheme="majorHAnsi"/>
+          <w:sz w:val="21"/>
+          <w:szCs w:val="21"/>
+        </w:rPr>
+        <w:br/>
+        <w:t>then offering to send me grain.</w:t>
       </w:r>
     </w:p>
     <w:p>
@@ -15857,43 +16295,61 @@
           <w:sz w:val="21"/>
           <w:szCs w:val="21"/>
         </w:rPr>
-        <w:t>I don’t call back home that much.</w:t>
-      </w:r>
-      <w:r>
-        <w:rPr>
-          <w:rFonts w:asciiTheme="majorHAnsi" w:hAnsiTheme="majorHAnsi" w:cstheme="majorHAnsi"/>
-          <w:sz w:val="21"/>
-          <w:szCs w:val="21"/>
-        </w:rPr>
-        <w:br/>
-        <w:t xml:space="preserve">Mum rings and asks, </w:t>
-      </w:r>
-      <w:r>
-        <w:rPr>
-          <w:rStyle w:val="Emphasis"/>
-          <w:rFonts w:asciiTheme="majorHAnsi" w:hAnsiTheme="majorHAnsi" w:cstheme="majorHAnsi"/>
-          <w:sz w:val="21"/>
-          <w:szCs w:val="21"/>
-        </w:rPr>
-        <w:t>“What’s up?”</w:t>
-      </w:r>
-      <w:r>
-        <w:rPr>
-          <w:rFonts w:asciiTheme="majorHAnsi" w:hAnsiTheme="majorHAnsi" w:cstheme="majorHAnsi"/>
-          <w:sz w:val="21"/>
-          <w:szCs w:val="21"/>
-        </w:rPr>
-        <w:br/>
-        <w:t>She knows it might go south,</w:t>
-      </w:r>
-      <w:r>
-        <w:rPr>
-          <w:rFonts w:asciiTheme="majorHAnsi" w:hAnsiTheme="majorHAnsi" w:cstheme="majorHAnsi"/>
-          <w:sz w:val="21"/>
-          <w:szCs w:val="21"/>
-        </w:rPr>
-        <w:br/>
-        <w:t>knows it can be cruel out here.</w:t>
+        <w:t>That kind of love makes me pray for rain.</w:t>
+      </w:r>
+      <w:r>
+        <w:rPr>
+          <w:rFonts w:asciiTheme="majorHAnsi" w:hAnsiTheme="majorHAnsi" w:cstheme="majorHAnsi"/>
+          <w:sz w:val="21"/>
+          <w:szCs w:val="21"/>
+        </w:rPr>
+        <w:br/>
+        <w:t>May the water never run dry.</w:t>
+      </w:r>
+      <w:r>
+        <w:rPr>
+          <w:rFonts w:asciiTheme="majorHAnsi" w:hAnsiTheme="majorHAnsi" w:cstheme="majorHAnsi"/>
+          <w:sz w:val="21"/>
+          <w:szCs w:val="21"/>
+        </w:rPr>
+        <w:br/>
+        <w:t xml:space="preserve">Let it flow long, like River </w:t>
+      </w:r>
+      <w:proofErr w:type="spellStart"/>
+      <w:r>
+        <w:rPr>
+          <w:rFonts w:asciiTheme="majorHAnsi" w:hAnsiTheme="majorHAnsi" w:cstheme="majorHAnsi"/>
+          <w:sz w:val="21"/>
+          <w:szCs w:val="21"/>
+        </w:rPr>
+        <w:t>Agoro</w:t>
+      </w:r>
+      <w:proofErr w:type="spellEnd"/>
+      <w:r>
+        <w:rPr>
+          <w:rFonts w:asciiTheme="majorHAnsi" w:hAnsiTheme="majorHAnsi" w:cstheme="majorHAnsi"/>
+          <w:sz w:val="21"/>
+          <w:szCs w:val="21"/>
+        </w:rPr>
+        <w:t>.</w:t>
+      </w:r>
+      <w:r>
+        <w:rPr>
+          <w:rFonts w:asciiTheme="majorHAnsi" w:hAnsiTheme="majorHAnsi" w:cstheme="majorHAnsi"/>
+          <w:sz w:val="21"/>
+          <w:szCs w:val="21"/>
+        </w:rPr>
+        <w:br/>
+        <w:t>May the sun be gentle on their skin.</w:t>
+      </w:r>
+      <w:r>
+        <w:rPr>
+          <w:rFonts w:asciiTheme="majorHAnsi" w:hAnsiTheme="majorHAnsi" w:cstheme="majorHAnsi"/>
+          <w:sz w:val="21"/>
+          <w:szCs w:val="21"/>
+        </w:rPr>
+        <w:br/>
+        <w:t>May Dad live to ninety.</w:t>
       </w:r>
     </w:p>
     <w:p>
@@ -15912,42 +16368,34 @@
           <w:sz w:val="21"/>
           <w:szCs w:val="21"/>
         </w:rPr>
-        <w:t>But her baby boy will never cry for help—</w:t>
-      </w:r>
-      <w:r>
-        <w:rPr>
-          <w:rFonts w:asciiTheme="majorHAnsi" w:hAnsiTheme="majorHAnsi" w:cstheme="majorHAnsi"/>
-          <w:sz w:val="21"/>
-          <w:szCs w:val="21"/>
-        </w:rPr>
-        <w:br/>
-        <w:t>walks alone</w:t>
-      </w:r>
-      <w:r>
-        <w:rPr>
-          <w:rFonts w:asciiTheme="majorHAnsi" w:hAnsiTheme="majorHAnsi" w:cstheme="majorHAnsi"/>
-          <w:sz w:val="21"/>
-          <w:szCs w:val="21"/>
-          <w:lang w:val="en-US"/>
-        </w:rPr>
-        <w:t>, back from hell</w:t>
-      </w:r>
-      <w:r>
-        <w:rPr>
-          <w:rFonts w:asciiTheme="majorHAnsi" w:hAnsiTheme="majorHAnsi" w:cstheme="majorHAnsi"/>
-          <w:sz w:val="21"/>
-          <w:szCs w:val="21"/>
-        </w:rPr>
-        <w:t xml:space="preserve"> </w:t>
-      </w:r>
-      <w:r>
-        <w:rPr>
-          <w:rFonts w:asciiTheme="majorHAnsi" w:hAnsiTheme="majorHAnsi" w:cstheme="majorHAnsi"/>
-          <w:sz w:val="21"/>
-          <w:szCs w:val="21"/>
-        </w:rPr>
-        <w:br/>
-        <w:t>That’s the life of a man, isn’t it?</w:t>
+        <w:t>May fish be plenty and cheap in Victoria.</w:t>
+      </w:r>
+      <w:r>
+        <w:rPr>
+          <w:rFonts w:asciiTheme="majorHAnsi" w:hAnsiTheme="majorHAnsi" w:cstheme="majorHAnsi"/>
+          <w:sz w:val="21"/>
+          <w:szCs w:val="21"/>
+        </w:rPr>
+        <w:br/>
+        <w:t>And God,</w:t>
+      </w:r>
+      <w:r>
+        <w:rPr>
+          <w:rFonts w:asciiTheme="majorHAnsi" w:hAnsiTheme="majorHAnsi" w:cstheme="majorHAnsi"/>
+          <w:sz w:val="21"/>
+          <w:szCs w:val="21"/>
+        </w:rPr>
+        <w:br/>
+        <w:t>may I have something in my pockets—</w:t>
+      </w:r>
+      <w:r>
+        <w:rPr>
+          <w:rFonts w:asciiTheme="majorHAnsi" w:hAnsiTheme="majorHAnsi" w:cstheme="majorHAnsi"/>
+          <w:sz w:val="21"/>
+          <w:szCs w:val="21"/>
+        </w:rPr>
+        <w:br/>
+        <w:t>something to show these humans I love them to death.</w:t>
       </w:r>
     </w:p>
     <w:p>
@@ -15966,43 +16414,59 @@
           <w:sz w:val="21"/>
           <w:szCs w:val="21"/>
         </w:rPr>
-        <w:t>That’s the love of a mother—</w:t>
-      </w:r>
-      <w:r>
-        <w:rPr>
-          <w:rFonts w:asciiTheme="majorHAnsi" w:hAnsiTheme="majorHAnsi" w:cstheme="majorHAnsi"/>
-          <w:sz w:val="21"/>
-          <w:szCs w:val="21"/>
-        </w:rPr>
-        <w:br/>
-        <w:t>with barely enough on her plate,</w:t>
-      </w:r>
-      <w:r>
-        <w:rPr>
-          <w:rFonts w:asciiTheme="majorHAnsi" w:hAnsiTheme="majorHAnsi" w:cstheme="majorHAnsi"/>
-          <w:sz w:val="21"/>
-          <w:szCs w:val="21"/>
-        </w:rPr>
-        <w:br/>
-        <w:t>still asking if I’m fed.</w:t>
-      </w:r>
-      <w:r>
-        <w:rPr>
-          <w:rFonts w:asciiTheme="majorHAnsi" w:hAnsiTheme="majorHAnsi" w:cstheme="majorHAnsi"/>
-          <w:sz w:val="21"/>
-          <w:szCs w:val="21"/>
-        </w:rPr>
-        <w:br/>
-        <w:t>Working the land,</w:t>
-      </w:r>
-      <w:r>
-        <w:rPr>
-          <w:rFonts w:asciiTheme="majorHAnsi" w:hAnsiTheme="majorHAnsi" w:cstheme="majorHAnsi"/>
-          <w:sz w:val="21"/>
-          <w:szCs w:val="21"/>
-        </w:rPr>
-        <w:br/>
-        <w:t>then offering to send me grain.</w:t>
+        <w:t>Because they give their all—</w:t>
+      </w:r>
+      <w:r>
+        <w:rPr>
+          <w:rFonts w:asciiTheme="majorHAnsi" w:hAnsiTheme="majorHAnsi" w:cstheme="majorHAnsi"/>
+          <w:sz w:val="21"/>
+          <w:szCs w:val="21"/>
+        </w:rPr>
+        <w:br/>
+        <w:t>that’s what parents do.</w:t>
+      </w:r>
+      <w:r>
+        <w:rPr>
+          <w:rFonts w:asciiTheme="majorHAnsi" w:hAnsiTheme="majorHAnsi" w:cstheme="majorHAnsi"/>
+          <w:sz w:val="21"/>
+          <w:szCs w:val="21"/>
+        </w:rPr>
+        <w:br/>
+        <w:t>And</w:t>
+      </w:r>
+      <w:r>
+        <w:rPr>
+          <w:rFonts w:asciiTheme="majorHAnsi" w:hAnsiTheme="majorHAnsi" w:cstheme="majorHAnsi"/>
+          <w:sz w:val="21"/>
+          <w:szCs w:val="21"/>
+          <w:lang w:val="en-US"/>
+        </w:rPr>
+        <w:t xml:space="preserve"> we…w</w:t>
+      </w:r>
+      <w:r>
+        <w:rPr>
+          <w:rFonts w:asciiTheme="majorHAnsi" w:hAnsiTheme="majorHAnsi" w:cstheme="majorHAnsi"/>
+          <w:sz w:val="21"/>
+          <w:szCs w:val="21"/>
+        </w:rPr>
+        <w:t>e</w:t>
+      </w:r>
+      <w:r>
+        <w:rPr>
+          <w:rFonts w:asciiTheme="majorHAnsi" w:hAnsiTheme="majorHAnsi" w:cstheme="majorHAnsi"/>
+          <w:sz w:val="21"/>
+          <w:szCs w:val="21"/>
+          <w:lang w:val="en-US"/>
+        </w:rPr>
+        <w:t xml:space="preserve"> are</w:t>
+      </w:r>
+      <w:r>
+        <w:rPr>
+          <w:rFonts w:asciiTheme="majorHAnsi" w:hAnsiTheme="majorHAnsi" w:cstheme="majorHAnsi"/>
+          <w:sz w:val="21"/>
+          <w:szCs w:val="21"/>
+        </w:rPr>
+        <w:t xml:space="preserve"> all just living for the first time.</w:t>
       </w:r>
     </w:p>
     <w:p>
@@ -16015,68 +16479,6 @@
           <w:szCs w:val="21"/>
         </w:rPr>
       </w:pPr>
-      <w:r>
-        <w:rPr>
-          <w:rFonts w:asciiTheme="majorHAnsi" w:hAnsiTheme="majorHAnsi" w:cstheme="majorHAnsi"/>
-          <w:sz w:val="21"/>
-          <w:szCs w:val="21"/>
-        </w:rPr>
-        <w:t>That kind of love makes me pray for rain.</w:t>
-      </w:r>
-      <w:r>
-        <w:rPr>
-          <w:rFonts w:asciiTheme="majorHAnsi" w:hAnsiTheme="majorHAnsi" w:cstheme="majorHAnsi"/>
-          <w:sz w:val="21"/>
-          <w:szCs w:val="21"/>
-        </w:rPr>
-        <w:br/>
-        <w:t>May the water never run dry.</w:t>
-      </w:r>
-      <w:r>
-        <w:rPr>
-          <w:rFonts w:asciiTheme="majorHAnsi" w:hAnsiTheme="majorHAnsi" w:cstheme="majorHAnsi"/>
-          <w:sz w:val="21"/>
-          <w:szCs w:val="21"/>
-        </w:rPr>
-        <w:br/>
-        <w:t xml:space="preserve">Let it flow long, like River </w:t>
-      </w:r>
-      <w:proofErr w:type="spellStart"/>
-      <w:r>
-        <w:rPr>
-          <w:rFonts w:asciiTheme="majorHAnsi" w:hAnsiTheme="majorHAnsi" w:cstheme="majorHAnsi"/>
-          <w:sz w:val="21"/>
-          <w:szCs w:val="21"/>
-        </w:rPr>
-        <w:t>Agoro</w:t>
-      </w:r>
-      <w:proofErr w:type="spellEnd"/>
-      <w:r>
-        <w:rPr>
-          <w:rFonts w:asciiTheme="majorHAnsi" w:hAnsiTheme="majorHAnsi" w:cstheme="majorHAnsi"/>
-          <w:sz w:val="21"/>
-          <w:szCs w:val="21"/>
-        </w:rPr>
-        <w:t>.</w:t>
-      </w:r>
-      <w:r>
-        <w:rPr>
-          <w:rFonts w:asciiTheme="majorHAnsi" w:hAnsiTheme="majorHAnsi" w:cstheme="majorHAnsi"/>
-          <w:sz w:val="21"/>
-          <w:szCs w:val="21"/>
-        </w:rPr>
-        <w:br/>
-        <w:t>May the sun be gentle on their skin.</w:t>
-      </w:r>
-      <w:r>
-        <w:rPr>
-          <w:rFonts w:asciiTheme="majorHAnsi" w:hAnsiTheme="majorHAnsi" w:cstheme="majorHAnsi"/>
-          <w:sz w:val="21"/>
-          <w:szCs w:val="21"/>
-        </w:rPr>
-        <w:br/>
-        <w:t>May Dad live to ninety.</w:t>
-      </w:r>
     </w:p>
     <w:p>
       <w:pPr>
@@ -16088,112 +16490,6 @@
           <w:szCs w:val="21"/>
         </w:rPr>
       </w:pPr>
-      <w:r>
-        <w:rPr>
-          <w:rFonts w:asciiTheme="majorHAnsi" w:hAnsiTheme="majorHAnsi" w:cstheme="majorHAnsi"/>
-          <w:sz w:val="21"/>
-          <w:szCs w:val="21"/>
-        </w:rPr>
-        <w:t>May fish be plenty and cheap in Victoria.</w:t>
-      </w:r>
-      <w:r>
-        <w:rPr>
-          <w:rFonts w:asciiTheme="majorHAnsi" w:hAnsiTheme="majorHAnsi" w:cstheme="majorHAnsi"/>
-          <w:sz w:val="21"/>
-          <w:szCs w:val="21"/>
-        </w:rPr>
-        <w:br/>
-        <w:t>And God,</w:t>
-      </w:r>
-      <w:r>
-        <w:rPr>
-          <w:rFonts w:asciiTheme="majorHAnsi" w:hAnsiTheme="majorHAnsi" w:cstheme="majorHAnsi"/>
-          <w:sz w:val="21"/>
-          <w:szCs w:val="21"/>
-        </w:rPr>
-        <w:br/>
-        <w:t>may I have something in my pockets—</w:t>
-      </w:r>
-      <w:r>
-        <w:rPr>
-          <w:rFonts w:asciiTheme="majorHAnsi" w:hAnsiTheme="majorHAnsi" w:cstheme="majorHAnsi"/>
-          <w:sz w:val="21"/>
-          <w:szCs w:val="21"/>
-        </w:rPr>
-        <w:br/>
-        <w:t>something to show these humans I love them to death.</w:t>
-      </w:r>
-    </w:p>
-    <w:p>
-      <w:pPr>
-        <w:pStyle w:val="NormalWeb"/>
-        <w:spacing w:after="0" w:afterAutospacing="0"/>
-        <w:rPr>
-          <w:rFonts w:asciiTheme="majorHAnsi" w:hAnsiTheme="majorHAnsi" w:cstheme="majorHAnsi"/>
-          <w:sz w:val="21"/>
-          <w:szCs w:val="21"/>
-        </w:rPr>
-      </w:pPr>
-      <w:r>
-        <w:rPr>
-          <w:rFonts w:asciiTheme="majorHAnsi" w:hAnsiTheme="majorHAnsi" w:cstheme="majorHAnsi"/>
-          <w:sz w:val="21"/>
-          <w:szCs w:val="21"/>
-        </w:rPr>
-        <w:t>Because they give their all—</w:t>
-      </w:r>
-      <w:r>
-        <w:rPr>
-          <w:rFonts w:asciiTheme="majorHAnsi" w:hAnsiTheme="majorHAnsi" w:cstheme="majorHAnsi"/>
-          <w:sz w:val="21"/>
-          <w:szCs w:val="21"/>
-        </w:rPr>
-        <w:br/>
-        <w:t>that’s what parents do.</w:t>
-      </w:r>
-      <w:r>
-        <w:rPr>
-          <w:rFonts w:asciiTheme="majorHAnsi" w:hAnsiTheme="majorHAnsi" w:cstheme="majorHAnsi"/>
-          <w:sz w:val="21"/>
-          <w:szCs w:val="21"/>
-        </w:rPr>
-        <w:br/>
-        <w:t>And</w:t>
-      </w:r>
-      <w:r>
-        <w:rPr>
-          <w:rFonts w:asciiTheme="majorHAnsi" w:hAnsiTheme="majorHAnsi" w:cstheme="majorHAnsi"/>
-          <w:sz w:val="21"/>
-          <w:szCs w:val="21"/>
-          <w:lang w:val="en-US"/>
-        </w:rPr>
-        <w:t xml:space="preserve"> we…w</w:t>
-      </w:r>
-      <w:r>
-        <w:rPr>
-          <w:rFonts w:asciiTheme="majorHAnsi" w:hAnsiTheme="majorHAnsi" w:cstheme="majorHAnsi"/>
-          <w:sz w:val="21"/>
-          <w:szCs w:val="21"/>
-        </w:rPr>
-        <w:t>e</w:t>
-      </w:r>
-      <w:r>
-        <w:rPr>
-          <w:rFonts w:asciiTheme="majorHAnsi" w:hAnsiTheme="majorHAnsi" w:cstheme="majorHAnsi"/>
-          <w:sz w:val="21"/>
-          <w:szCs w:val="21"/>
-          <w:lang w:val="en-US"/>
-        </w:rPr>
-        <w:t xml:space="preserve"> are</w:t>
-      </w:r>
-      <w:r>
-        <w:rPr>
-          <w:rFonts w:asciiTheme="majorHAnsi" w:hAnsiTheme="majorHAnsi" w:cstheme="majorHAnsi"/>
-          <w:sz w:val="21"/>
-          <w:szCs w:val="21"/>
-        </w:rPr>
-        <w:t xml:space="preserve"> all just living for the first time.</w:t>
-      </w:r>
     </w:p>
     <w:p>
       <w:pPr>
@@ -16221,6 +16517,7 @@
           <w:szCs w:val="21"/>
           <w:lang w:val="en-US"/>
         </w:rPr>
+        <w:lastRenderedPageBreak/>
         <w:t>FAMILY FIRST</w:t>
       </w:r>
     </w:p>
@@ -16597,15 +16894,6 @@
           <w:lang w:val="en-US"/>
         </w:rPr>
         <w:br/>
-      </w:r>
-      <w:r>
-        <w:rPr>
-          <w:rFonts w:asciiTheme="majorHAnsi" w:hAnsiTheme="majorHAnsi" w:cstheme="majorHAnsi"/>
-          <w:sz w:val="21"/>
-          <w:szCs w:val="21"/>
-          <w:lang w:val="en-US"/>
-        </w:rPr>
-        <w:lastRenderedPageBreak/>
         <w:t xml:space="preserve">I know </w:t>
       </w:r>
       <w:r>
@@ -16807,6 +17095,7 @@
           <w:highlight w:val="darkCyan"/>
           <w:lang w:val="en-US"/>
         </w:rPr>
+        <w:lastRenderedPageBreak/>
         <w:t>Family series explains that which I don’t know how to, not even with humans I am clos</w:t>
       </w:r>
       <w:r>
@@ -17330,6 +17619,7 @@
           <w:szCs w:val="21"/>
           <w:lang w:val="en-US"/>
         </w:rPr>
+        <w:lastRenderedPageBreak/>
         <w:t>noodles children, he would say then we a</w:t>
       </w:r>
       <w:r>
@@ -17639,8 +17929,16 @@
           <w:szCs w:val="21"/>
           <w:lang w:val="en-US"/>
         </w:rPr>
+        <w:br/>
+      </w:r>
+      <w:r>
+        <w:rPr>
+          <w:rFonts w:asciiTheme="majorHAnsi" w:hAnsiTheme="majorHAnsi" w:cstheme="majorHAnsi"/>
+          <w:sz w:val="21"/>
+          <w:szCs w:val="21"/>
+          <w:lang w:val="en-US"/>
+        </w:rPr>
         <w:lastRenderedPageBreak/>
-        <w:br/>
         <w:t>then a smile forms in the corner of his mouth,</w:t>
       </w:r>
       <w:r>
@@ -17829,8 +18127,8 @@
       <w:rPr>
         <w:i/>
         <w:iCs/>
-        <w:sz w:val="12"/>
-        <w:szCs w:val="12"/>
+        <w:sz w:val="8"/>
+        <w:szCs w:val="8"/>
         <w:lang w:val="en-US"/>
       </w:rPr>
     </w:pPr>
@@ -17838,11 +18136,11 @@
       <w:rPr>
         <w:i/>
         <w:iCs/>
-        <w:sz w:val="12"/>
-        <w:szCs w:val="12"/>
+        <w:sz w:val="8"/>
+        <w:szCs w:val="8"/>
         <w:lang w:val="en-US"/>
       </w:rPr>
-      <w:t>With Love- Nyakito</w:t>
+      <w:t>With Love</w:t>
     </w:r>
   </w:p>
 </w:ftr>
@@ -17883,6 +18181,7 @@
         <w:docPartUnique/>
       </w:docPartObj>
     </w:sdtPr>
+    <w:sdtEndPr/>
     <w:sdtContent>
       <w:p>
         <w:pPr>
@@ -19116,7 +19415,6 @@
     <w:name w:val="Normal (Web)"/>
     <w:basedOn w:val="Normal"/>
     <w:uiPriority w:val="99"/>
-    <w:semiHidden/>
     <w:unhideWhenUsed/>
     <w:rsid w:val="00002E84"/>
     <w:pPr>

</xml_diff>